<commit_message>
Fix R2 TEID ownership, UE data path and live validation; label the live run
- R2: first source wins, keyed on (receiving address, TEID) from the outer
  IPv4/IPv6 header; only an allowlisted gNB takes ownership. Fixes 16 FP and
  15 FN on the live corpus; offline metrics unchanged.
- core: configure ogstun and NAT so UE traffic reaches the data network; the
  old nr-binder check bypassed the tunnel.
- make live-score: score the exact make attack corpus per packet (P=R=1.0).
- Docs, figures and exports updated: labelled live results (608 before,
  550 after), seven defects, corrected timing and Zeek wording.
</commit_message>
<xml_diff>
--- a/paper/manuscript_v2.docx
+++ b/paper/manuscript_v2.docx
@@ -85,7 +85,7 @@
         <w:pStyle w:val="BodyText"/>
       </w:pPr>
       <w:r>
-        <w:t xml:space="preserve">The detector is evaluated on a seeded 1,320-packet labelled corpus whose 720 benign packets span twelve traffic categories, including two deliberately adversarial ones: non-IP Unstructured-PDU payloads crafted to collide with the detector's nested-tunnel heuristic, and legitimate Xn handovers that are structurally indistinguishable from TEID spoofing on the user plane alone. On this corpus the detector reaches precision 1.0, recall 1.0, F1 1.0 and a false-positive rate of 0.0, with zero standard deviation across five seeds, at a mean per-packet cost of 686 µs including packet dissection. Three further results accompany the headline score rather than replacing it: a naive baseline that differs only in omitting the payload re-parse misses 100% of nested tunnels (F1 0.889); a false-positive ablation traces every residual false alarm, six in 720 benign packets, to legitimate handovers and removes them with an operator-supplied gNB allowlist; and an eleven-case evasion suite states explicitly which crafted evasions the detector catches (six) and which are documented blind spots of a stateless user-plane-only rule (four), with a further case in which required silence is correct behaviour rather than a miss. The same engine was then exercised against genuinely transmitted traffic from a live 5G core and radio simulator, where it raised 131 findings across all four rules with no crashes.</w:t>
+        <w:t xml:space="preserve">The detector is evaluated on a seeded 1,320-packet labelled corpus whose 720 benign packets span twelve traffic categories, including two deliberately adversarial ones: non-IP Unstructured-PDU payloads crafted to collide with the detector's nested-tunnel heuristic, and legitimate Xn handovers that are structurally indistinguishable from TEID spoofing on the user plane alone. On this corpus the detector reaches precision 1.0, recall 1.0, F1 1.0 and a false-positive rate of 0.0, with zero standard deviation across five seeds, at a mean per-packet cost of 686 µs including packet dissection. Three further results accompany the headline score rather than replacing it: a naive baseline that differs only in omitting the payload re-parse misses 100% of nested tunnels (F1 0.889); a false-positive ablation traces every residual false alarm, six in 720 benign packets, to legitimate handovers and removes them with an operator-supplied gNB allowlist; and an eleven-case evasion suite states explicitly which crafted evasions the detector catches (six) and which are documented blind spots of a stateless user-plane-only rule (four), with a further case in which required silence is correct behaviour rather than a miss. The same engine was then run against a 500-packet labelled corpus transmitted onto the N3 interface of a live Open5GS core and UERANSIM radio simulator, where it observed all 500 packets and raised findings from all four rules with no crashes. Scored packet by packet against its labels, that run exposed a TEID-ownership defect in the spoofing rule (precision 0.960, recall 0.9625, false-positive rate 0.16); with the defect fixed, the same packet sequence scores precision, recall and F1 of 1.0 with a false-positive rate of 0.0, and every offline result above is unchanged.</w:t>
       </w:r>
     </w:p>
     <w:p>
@@ -93,7 +93,7 @@
         <w:pStyle w:val="BodyText"/>
       </w:pPr>
       <w:r>
-        <w:t xml:space="preserve">The study also reports two robustness results. First, the default Scapy dissection of GTP-U returns a nested GTP header as opaque bytes, so a naive layer check misses every nested-tunnel packet on captured or live traffic while an in-memory unit test still passes; a payload re-parse restores nested-tunnel detection from 0.0 to 1.0. Second, bringing the live path up for the first time exposed five real defects that a fully passing offline suite could not reach, including a generator that had been emitting malformed Ethernet frames on every live run. Taken together, the results support a practical recommendation: for security tools that read or write real wire traffic, an offline suite that only replays or builds packets in memory is necessary but not sufficient, and a corpus whose negative class lacks diversity is a third way for a passing suite to mislead.</w:t>
+        <w:t xml:space="preserve">The study also reports two robustness results. First, the default Scapy dissection of GTP-U does not decode a nested GTP header, leaving it as opaque bytes or mis-guessing it as another protocol such as PPP, so a naive layer check misses every nested-tunnel packet on captured or live traffic while an in-memory unit test still passes; a payload re-parse restores nested-tunnel detection from 0.0 to 1.0. Second, bringing the live path up for the first time exposed five real defects that a fully passing offline suite could not reach, including a generator that had been emitting malformed Ethernet frames on every live run, and re-running the live laboratory during revision exposed two more: a capture during the documented ping showed that it never entered the tunnel, and the UPF log showed that no handset packet had ever reached the data network, hidden by a check that reported success, and scoring the live corpus against its labels exposed the TEID-ownership defect, which the offline corpus never triggered. Taken together, the results support a practical recommendation: for security tools that read or write real wire traffic, an offline suite that only replays or builds packets in memory is necessary but not sufficient, and a corpus whose negative class lacks diversity is a third way for a passing suite to mislead.</w:t>
       </w:r>
     </w:p>
     <w:p>
@@ -271,7 +271,7 @@
         <w:pStyle w:val="Compact"/>
       </w:pPr>
       <w:r>
-        <w:t xml:space="preserve">A robustness finding inside the detector itself. The default Scapy dissection of a GTP-U payload reads a nested GTP header as opaque bytes, so a naive layer check on captured or live traffic misses every nested-tunnel packet, while an in-memory unit test that builds the layers directly in Python still passes. The detector re-parses the payload to close this gap, which restores nested-tunnel detection from 0.0 to 1.0 without introducing a single false positive on the adversarial benign categories.</w:t>
+        <w:t xml:space="preserve">A robustness finding inside the detector itself. The default Scapy dissection of a GTP-U payload does not decode a nested GTP header, leaving it as opaque bytes or mis-guessing it as another protocol, so a naive layer check on captured or live traffic misses every nested-tunnel packet, while an in-memory unit test that builds the layers directly in Python still passes. The detector re-parses the payload to close this gap, which restores nested-tunnel detection from 0.0 to 1.0 without introducing a single false positive on the adversarial benign categories.</w:t>
       </w:r>
     </w:p>
     <w:p>
@@ -283,7 +283,7 @@
         <w:pStyle w:val="Compact"/>
       </w:pPr>
       <w:r>
-        <w:t xml:space="preserve">Live validation of the same engine against genuinely transmitted 5G traffic, confirming that it detects the same rule classes on the wire that it detects offline, together with an explicit statement of what the live experiment does and does not model.</w:t>
+        <w:t xml:space="preserve">Live validation of the same engine against genuinely transmitted 5G traffic, scored packet by packet against labels, confirming that it detects the same rule classes on the wire that it detects offline and that its live findings match an offline pass over the same packets finding for finding, together with an explicit statement of what the live experiment does and does not model.</w:t>
       </w:r>
     </w:p>
     <w:p>
@@ -295,7 +295,7 @@
         <w:pStyle w:val="Compact"/>
       </w:pPr>
       <w:r>
-        <w:t xml:space="preserve">A documented case study of five defects found only by running the live path, including a traffic generator that had been sending malformed Ethernet frames on every live run since the project began.</w:t>
+        <w:t xml:space="preserve">A documented case study of seven defects found only by running the live path, including a traffic generator that had been sending malformed Ethernet frames on every live run since the project began, and a TEID-ownership defect in the spoofing rule that the offline corpus never triggered.</w:t>
       </w:r>
     </w:p>
     <w:p>
@@ -372,7 +372,7 @@
         <w:pStyle w:val="BodyText"/>
       </w:pPr>
       <w:r>
-        <w:t xml:space="preserve">One clarification is required, because it bears on how the live experiment of Section 4.7 should be read. In the containerised laboratory the attack generator shares the core's network namespace, so the packets it transmits are genuinely serialised onto a socket and genuinely dissected off an interface, but they originate on the UPF host rather than arriving from a remote endpoint on the N3 segment. The live experiment therefore validates the detector's behaviour on transmitted rather than replayed bytes; it does not by itself demonstrate detection of a remote N3 adversary. Section 4.10 records this as a limitation and Section 5 as future work.</w:t>
+        <w:t xml:space="preserve">One clarification is required, because it bears on how the live experiment of Section 4.7 should be read. In the containerised laboratory the attack generator shares the core's network namespace. It is not a handset and holds no PDU session: it writes crafted GTP-U with a raw socket onto the core's N3 interface, addressed to the UPF, and the radio simulator does not encapsulate these packets. Its packets are genuinely serialised onto a socket and genuinely dissected off an interface, but they originate on the UPF host rather than arriving from a remote endpoint on the N3 segment, and they stand in for the on-path position of this threat model. The live experiment therefore validates the detector's behaviour on transmitted rather than replayed bytes; it does not by itself demonstrate detection of a remote N3 adversary. Section 4.10 records this as a limitation and Section 5 as future work.</w:t>
       </w:r>
     </w:p>
     <w:p>
@@ -514,7 +514,7 @@
         <w:pStyle w:val="FirstParagraph"/>
       </w:pPr>
       <w:r>
-        <w:t xml:space="preserve">Open5GS provides a standards-tracking implementation of the AMF, SMF, UPF and supporting functions in software, and UERANSIM provides a software gNB and handset that generate genuine NGAP, NAS and GTP-U traffic without radio hardware. free5GC offers a second independent core implementation and srsRAN a software-radio path to over-the-air testing. Salazar et al. (2021) released 5Greplay, an open fuzzer that replays and mutates signalling traffic against cores and intrusion-detection systems, and Salazar et al. (2023) added a mutation-based ontology for testing whether IDS rules survive traffic mutation; both produce attacks rather than detections, and both are oriented towards signalling. Scapy is the de-facto library for constructing and dissecting custom protocol traffic, GTP included, and Wireshark is the manual counterpart analysts use to read GTP by hand. One property of Scapy is central to this paper: its GTP-U dissector returns a nested GTP header as opaque bytes, so the obvious layer check misses GTP-in-GTP on real traffic while an in-memory test still passes. None of the detection literature reviewed here flags this behaviour, and closing it is one of the objectives of this study.</w:t>
+        <w:t xml:space="preserve">Open5GS provides a standards-tracking implementation of the AMF, SMF, UPF and supporting functions in software, and UERANSIM provides a software gNB and handset that generate genuine NGAP, NAS and GTP-U traffic without radio hardware. free5GC offers a second independent core implementation and srsRAN a software-radio path to over-the-air testing. Salazar et al. (2021) released 5Greplay, an open fuzzer that replays and mutates signalling traffic against cores and intrusion-detection systems, and Salazar et al. (2023) added a mutation-based ontology for testing whether IDS rules survive traffic mutation; both produce attacks rather than detections, and both are oriented towards signalling. Scapy is the de-facto library for constructing and dissecting custom protocol traffic, GTP included, and Wireshark is the manual counterpart analysts use to read GTP by hand. One property of Scapy is central to this paper: its GTP-U dissector does not decode a nested GTP header, returning it as opaque bytes or mis-guessing it as another protocol, so the obvious layer check misses GTP-in-GTP on real traffic while an in-memory test still passes. None of the detection literature reviewed here flags this behaviour, and closing it is one of the objectives of this study.</w:t>
       </w:r>
     </w:p>
     <w:p>
@@ -1733,7 +1733,62 @@
         <w:pStyle w:val="FirstParagraph"/>
       </w:pPr>
       <w:r>
-        <w:t xml:space="preserve">As illustrated in Fig. 1, the testbed places a real handset and base station, a real 5G core and a passive detector on a single isolated Docker bridge. All communication begins at the simulated handset, which completes a genuine NGAP and NAS registration and establishes a PDU session with the core. Subscriber traffic is then tunnelled from the gNB to the UPF over N3 as GTP-U on UDP 2152, and forwarded by the UPF to the external data network. The attack generator, which exists only to exercise the detector, injects abuse traffic at the UPF from within the same isolated bridge. The detector observes, and never modifies, the resulting N3 traffic. Table 2 lists the components and their roles.</w:t>
+        <w:t xml:space="preserve">As illustrated in Fig. 1, the testbed places a real handset and base station, a real 5G core and a passive detector on a single isolated Docker bridge. Legitimate subscriber traffic begins at the simulated handset, which completes a genuine NGAP and NAS registration and establishes an IPv4 PDU session with the core. Subscriber traffic is then tunnelled from the gNB to the UPF over N3 as GTP-U on UDP 2152, and forwarded by the UPF to the external data network. The attack generator, which exists only to exercise the detector, is not a handset and holds no PDU session: it shares the core's network namespace and writes crafted GTP-U with a raw socket onto the core's N3 interface, addressed to the UPF, standing in for an on-path attacker on the N3 segment. The detector observes, and never modifies, the resulting N3 traffic. Table 2 lists the components and their roles.</w:t>
+      </w:r>
+    </w:p>
+    <w:p>
+      <w:pPr>
+        <w:pStyle w:val="CaptionedFigure"/>
+      </w:pPr>
+      <w:r>
+        <w:drawing>
+          <wp:inline>
+            <wp:extent cx="5334000" cy="2667000"/>
+            <wp:effectExtent b="0" l="0" r="0" t="0"/>
+            <wp:docPr descr="Testbed topology, attacker position and detector tap point" title="" id="1" name="Picture"/>
+            <a:graphic>
+              <a:graphicData uri="http://schemas.openxmlformats.org/drawingml/2006/picture">
+                <pic:pic>
+                  <pic:nvPicPr>
+                    <pic:cNvPr descr="figures/manuscript/image3.png" id="0" name="Picture"/>
+                    <pic:cNvPicPr>
+                      <a:picLocks noChangeArrowheads="1" noChangeAspect="1"/>
+                    </pic:cNvPicPr>
+                  </pic:nvPicPr>
+                  <pic:blipFill>
+                    <a:blip r:embed="rId37"/>
+                    <a:stretch>
+                      <a:fillRect/>
+                    </a:stretch>
+                  </pic:blipFill>
+                  <pic:spPr bwMode="auto">
+                    <a:xfrm>
+                      <a:off x="0" y="0"/>
+                      <a:ext cx="5334000" cy="2667000"/>
+                    </a:xfrm>
+                    <a:prstGeom prst="rect">
+                      <a:avLst/>
+                    </a:prstGeom>
+                    <a:noFill/>
+                    <a:ln w="9525">
+                      <a:noFill/>
+                      <a:headEnd/>
+                      <a:tailEnd/>
+                    </a:ln>
+                  </pic:spPr>
+                </pic:pic>
+              </a:graphicData>
+            </a:graphic>
+          </wp:inline>
+        </w:drawing>
+      </w:r>
+    </w:p>
+    <w:p>
+      <w:pPr>
+        <w:pStyle w:val="ImageCaption"/>
+      </w:pPr>
+      <w:r>
+        <w:t xml:space="preserve">Testbed topology, attacker position and detector tap point</w:t>
       </w:r>
     </w:p>
     <w:p>
@@ -1750,7 +1805,7 @@
         <w:t xml:space="preserve"> </w:t>
       </w:r>
       <w:r>
-        <w:t xml:space="preserve">Testbed topology, attacker position and detector tap point on the N3 interface.</w:t>
+        <w:t xml:space="preserve">Testbed topology, attacker position and detector tap point on the N3 interface. The attack generator is not a handset: it shares the core's network namespace and writes crafted GTP-U onto the N3 interface.</w:t>
       </w:r>
     </w:p>
     <w:p>
@@ -1959,11 +2014,11 @@
       <w:pPr>
         <w:pStyle w:val="Heading3"/>
       </w:pPr>
-      <w:bookmarkStart w:id="37" w:name="detector-placement-and-network-namespace"/>
+      <w:bookmarkStart w:id="38" w:name="detector-placement-and-network-namespace"/>
       <w:r>
         <w:t xml:space="preserve">3.3. Detector placement and network namespace</w:t>
       </w:r>
-      <w:bookmarkEnd w:id="37"/>
+      <w:bookmarkEnd w:id="38"/>
     </w:p>
     <w:p>
       <w:pPr>
@@ -1997,7 +2052,19 @@
         <w:t xml:space="preserve"> </w:t>
       </w:r>
       <w:r>
-        <w:t xml:space="preserve">interface. This is the same tap point a real GTP firewall occupies, rather than a port-mirroring approximation, and it is the reason the live findings in Section 4.7 are drawn from traffic that genuinely traversed the core's interface.</w:t>
+        <w:t xml:space="preserve">interface passively, with the capture filter</w:t>
+      </w:r>
+      <w:r>
+        <w:t xml:space="preserve"> </w:t>
+      </w:r>
+      <w:r>
+        <w:rPr>
+          <w:rStyle w:val="VerbatimChar"/>
+        </w:rPr>
+        <w:t xml:space="preserve">udp port 2152</w:t>
+      </w:r>
+      <w:r>
+        <w:t xml:space="preserve">. This is the same tap point a real GTP firewall occupies, rather than a port-mirroring approximation, and it is the reason the live findings in Section 4.7 are drawn from traffic that genuinely traversed the core's interface.</w:t>
       </w:r>
     </w:p>
     <w:p>
@@ -2005,18 +2072,33 @@
         <w:pStyle w:val="BodyText"/>
       </w:pPr>
       <w:r>
-        <w:t xml:space="preserve">The attack generator shares the same namespace for the live path. This has two consequences, both of which are stated rather than absorbed. Operationally, recreating the core container silently orphans the detector, documented as a defect in Section 4.9. Methodologically, the live attack packets originate on the UPF host rather than arriving from a remote N3 endpoint, so the live experiment demonstrates correct behaviour on transmitted bytes but not detection of a remote adversary; Section 4.10 records this.</w:t>
+        <w:t xml:space="preserve">The attack generator shares the same namespace for the live path. This has two consequences, both of which are stated rather than absorbed. Operationally, recreating the core container silently orphans the detector, documented as a defect in Section 4.9. Methodologically, the live attack packets originate on the UPF host rather than arriving from a remote N3 endpoint, so the live experiment demonstrates correct behaviour on transmitted bytes but not detection of a remote adversary; Section 4.10 records this. Whether the UPF acts on the crafted frames was not measured; the detector observes them on</w:t>
+      </w:r>
+      <w:r>
+        <w:t xml:space="preserve"> </w:t>
+      </w:r>
+      <w:r>
+        <w:rPr>
+          <w:rStyle w:val="VerbatimChar"/>
+        </w:rPr>
+        <w:t xml:space="preserve">eth0</w:t>
+      </w:r>
+      <w:r>
+        <w:t xml:space="preserve"> </w:t>
+      </w:r>
+      <w:r>
+        <w:t xml:space="preserve">as a tap would.</w:t>
       </w:r>
     </w:p>
     <w:p>
       <w:pPr>
         <w:pStyle w:val="Heading3"/>
       </w:pPr>
-      <w:bookmarkStart w:id="38" w:name="operating-modes"/>
+      <w:bookmarkStart w:id="39" w:name="operating-modes"/>
       <w:r>
         <w:t xml:space="preserve">3.4. Operating modes</w:t>
       </w:r>
-      <w:bookmarkEnd w:id="38"/>
+      <w:bookmarkEnd w:id="39"/>
     </w:p>
     <w:p>
       <w:pPr>
@@ -2030,11 +2112,11 @@
       <w:pPr>
         <w:pStyle w:val="Heading3"/>
       </w:pPr>
-      <w:bookmarkStart w:id="39" w:name="dataset"/>
+      <w:bookmarkStart w:id="40" w:name="dataset"/>
       <w:r>
         <w:t xml:space="preserve">3.5. Dataset</w:t>
       </w:r>
-      <w:bookmarkEnd w:id="39"/>
+      <w:bookmarkEnd w:id="40"/>
     </w:p>
     <w:p>
       <w:pPr>
@@ -2915,7 +2997,7 @@
         <w:pStyle w:val="BodyText"/>
       </w:pPr>
       <w:r>
-        <w:t xml:space="preserve">It is worth stating why the benign class is constructed this way, because the corpus used in an earlier version of this work was not. That corpus paired 400 malicious packets with 400 copies of a single benign ICMP shape, all sharing one TEID. A negative class with one member cannot exercise a heuristic, and a shared TEID makes the first-seen ownership rule of Section 3.6.2 behave in a way that is a property of the corpus rather than of the rule: scored on that corpus, the detector reported here achieves precision 0.911 and a false-positive rate of 0.095, not because the rules are wrong but because ownership of the single TEID oscillates between the legitimate and the rogue source. The corpus of Table 4 was built to remove that artefact. This is a third instance of the general lesson of Section 4.9, at the level of the evaluation rather than the code.</w:t>
+        <w:t xml:space="preserve">It is worth stating why the benign class is constructed this way, because the corpus used in an earlier version of this work was not. That corpus paired 400 malicious packets with 400 copies of a single benign ICMP shape, all sharing one TEID. A negative class with one member cannot exercise a heuristic. The shared TEID also interacted with R2: scored on that corpus, the detector with the R2 code of the time reached precision 0.911 and a false-positive rate of 0.095, because R2 then handed ownership of the single TEID to whichever source sent last, so ownership oscillated between the legitimate and the rogue source. That was read at the time as a property of the corpus rather than of the rule. The labelled live run of Section 4.7 later showed it to be a defect in the rule itself, recorded as defect 7 in Section 4.9 and now fixed. The corpus of Table 4 was built to remove both properties: its benign class spans twelve categories, and each spoof reuses its own victim TEID. As Section 4.9 records, the second choice is also why the offline corpus never exposed the R2 defect. This is a third instance of the general lesson of Section 4.9, at the level of the evaluation rather than the code.</w:t>
       </w:r>
     </w:p>
     <w:p>
@@ -2930,11 +3012,11 @@
       <w:pPr>
         <w:pStyle w:val="Heading3"/>
       </w:pPr>
-      <w:bookmarkStart w:id="40" w:name="gtp-u-abuse-detection-algorithm"/>
+      <w:bookmarkStart w:id="41" w:name="gtp-u-abuse-detection-algorithm"/>
       <w:r>
         <w:t xml:space="preserve">3.6. GTP-U abuse detection algorithm</w:t>
       </w:r>
-      <w:bookmarkEnd w:id="40"/>
+      <w:bookmarkEnd w:id="41"/>
     </w:p>
     <w:p>
       <w:pPr>
@@ -2956,7 +3038,62 @@
         <w:t xml:space="preserve"> </w:t>
       </w:r>
       <w:r>
-        <w:t xml:space="preserve">that returns a list of findings, and every GTP-U packet is passed to each rule by a dispatcher that catches and discards any exception raised by a single rule, so that one malformed packet cannot crash the detector. This behaviour is verified by a dedicated test. The shared detector state holds only what the rules require: a map from TEID to the source address currently associated with it, for R2; an operator-supplied set of known gNB addresses, also for R2; and a configured set of core function addresses, for R4. Fig. 2 shows the resulting detection scheme, the boxed algorithm gives the dispatcher and rule logic in pseudocode, and Table 5 summarises the four rules, the abuse class each covers and the severity assigned to it.</w:t>
+        <w:t xml:space="preserve">that returns a list of findings, and every GTP-U packet is passed to each rule by a dispatcher that catches and discards any exception raised by a single rule, so that one malformed packet cannot crash the detector. This behaviour is verified by a dedicated test. The shared detector state holds only what the rules require: a map from each (receiving address, TEID) pair to the source address that owns it, for R2; an operator-supplied set of known gNB addresses, also for R2; and a configured set of core function addresses, for R4. Fig. 2 shows the resulting detection scheme, the boxed algorithm gives the dispatcher and rule logic in pseudocode, and Table 5 summarises the four rules, the abuse class each covers and the severity assigned to it.</w:t>
+      </w:r>
+    </w:p>
+    <w:p>
+      <w:pPr>
+        <w:pStyle w:val="CaptionedFigure"/>
+      </w:pPr>
+      <w:r>
+        <w:drawing>
+          <wp:inline>
+            <wp:extent cx="2933413" cy="4672836"/>
+            <wp:effectExtent b="0" l="0" r="0" t="0"/>
+            <wp:docPr descr="Detection pipeline with the targeted re-parse" title="" id="1" name="Picture"/>
+            <a:graphic>
+              <a:graphicData uri="http://schemas.openxmlformats.org/drawingml/2006/picture">
+                <pic:pic>
+                  <pic:nvPicPr>
+                    <pic:cNvPr descr="figures/manuscript/image4.png" id="0" name="Picture"/>
+                    <pic:cNvPicPr>
+                      <a:picLocks noChangeArrowheads="1" noChangeAspect="1"/>
+                    </pic:cNvPicPr>
+                  </pic:nvPicPr>
+                  <pic:blipFill>
+                    <a:blip r:embed="rId42"/>
+                    <a:stretch>
+                      <a:fillRect/>
+                    </a:stretch>
+                  </pic:blipFill>
+                  <pic:spPr bwMode="auto">
+                    <a:xfrm>
+                      <a:off x="0" y="0"/>
+                      <a:ext cx="2933413" cy="4672836"/>
+                    </a:xfrm>
+                    <a:prstGeom prst="rect">
+                      <a:avLst/>
+                    </a:prstGeom>
+                    <a:noFill/>
+                    <a:ln w="9525">
+                      <a:noFill/>
+                      <a:headEnd/>
+                      <a:tailEnd/>
+                    </a:ln>
+                  </pic:spPr>
+                </pic:pic>
+              </a:graphicData>
+            </a:graphic>
+          </wp:inline>
+        </w:drawing>
+      </w:r>
+    </w:p>
+    <w:p>
+      <w:pPr>
+        <w:pStyle w:val="ImageCaption"/>
+      </w:pPr>
+      <w:r>
+        <w:t xml:space="preserve">Detection pipeline with the targeted re-parse</w:t>
       </w:r>
     </w:p>
     <w:p>
@@ -3095,7 +3232,7 @@
         <w:rPr>
           <w:rStyle w:val="VerbatimChar"/>
         </w:rPr>
-        <w:t xml:space="preserve">        # re-parse an opaque payload before any rule runs (Section 3.7)</w:t>
+        <w:t xml:space="preserve">        # re-check any payload not decoded as IPv4, IPv6 or GTP (Section 3.7)</w:t>
       </w:r>
       <w:r>
         <w:br/>
@@ -3104,7 +3241,7 @@
         <w:rPr>
           <w:rStyle w:val="VerbatimChar"/>
         </w:rPr>
-        <w:t xml:space="preserve"> 8.     if inner is opaque bytes and looks_like_gtp(inner):</w:t>
+        <w:t xml:space="preserve"> 8.     if inner not in (IPv4, IPv6, GTP header) and looks_like_gtp(bytes(inner)):</w:t>
       </w:r>
       <w:r>
         <w:br/>
@@ -3113,7 +3250,7 @@
         <w:rPr>
           <w:rStyle w:val="VerbatimChar"/>
         </w:rPr>
-        <w:t xml:space="preserve"> 9.         inner = parse_as_gtp_header(inner)</w:t>
+        <w:t xml:space="preserve"> 9.         inner = parse_as_gtp_header(bytes(inner))</w:t>
       </w:r>
       <w:r>
         <w:br/>
@@ -3188,7 +3325,7 @@
         <w:rPr>
           <w:rStyle w:val="VerbatimChar"/>
         </w:rPr>
-        <w:t xml:space="preserve">    # gate applied before re-parsing opaque bytes (all five must hold)</w:t>
+        <w:t xml:space="preserve">    # gate applied to the payload's raw bytes before re-parsing (all five must hold)</w:t>
       </w:r>
       <w:r>
         <w:br/>
@@ -3293,7 +3430,7 @@
         <w:rPr>
           <w:rStyle w:val="VerbatimChar"/>
         </w:rPr>
-        <w:t xml:space="preserve">    # R2 TEID spoofing, ownership tracking with handover suppression</w:t>
+        <w:t xml:space="preserve">    # R2 TEID spoofing: first source owns (receiving address, TEID); only an allowlisted gNB takes it over</w:t>
       </w:r>
       <w:r>
         <w:br/>
@@ -3302,7 +3439,7 @@
         <w:rPr>
           <w:rStyle w:val="VerbatimChar"/>
         </w:rPr>
-        <w:t xml:space="preserve">25. if gtp.teid not in state.teid_owner:</w:t>
+        <w:t xml:space="preserve">25. key = (outer.dst, gtp.teid)                    # outer = IPv4/IPv6 header carrying the tunnel</w:t>
       </w:r>
       <w:r>
         <w:br/>
@@ -3311,7 +3448,7 @@
         <w:rPr>
           <w:rStyle w:val="VerbatimChar"/>
         </w:rPr>
-        <w:t xml:space="preserve">26.     state.teid_owner[gtp.teid] = pkt[IP].src</w:t>
+        <w:t xml:space="preserve">26. owner = state.teid_owner.get(key)</w:t>
       </w:r>
       <w:r>
         <w:br/>
@@ -3320,7 +3457,7 @@
         <w:rPr>
           <w:rStyle w:val="VerbatimChar"/>
         </w:rPr>
-        <w:t xml:space="preserve">27. elif state.teid_owner[gtp.teid] != pkt[IP].src:</w:t>
+        <w:t xml:space="preserve">27. if owner is None: state.teid_owner[key] = outer.src     # first source owns</w:t>
       </w:r>
       <w:r>
         <w:br/>
@@ -3329,7 +3466,7 @@
         <w:rPr>
           <w:rStyle w:val="VerbatimChar"/>
         </w:rPr>
-        <w:t xml:space="preserve">28.     old = state.teid_owner[gtp.teid]</w:t>
+        <w:t xml:space="preserve">28. elif owner != outer.src:</w:t>
       </w:r>
       <w:r>
         <w:br/>
@@ -3338,7 +3475,7 @@
         <w:rPr>
           <w:rStyle w:val="VerbatimChar"/>
         </w:rPr>
-        <w:t xml:space="preserve">29.     state.teid_owner[gtp.teid] = pkt[IP].src    # latest source becomes owner</w:t>
+        <w:t xml:space="preserve">29.     if state.gnb_ips and outer.src in state.gnb_ips:</w:t>
       </w:r>
       <w:r>
         <w:br/>
@@ -3347,7 +3484,7 @@
         <w:rPr>
           <w:rStyle w:val="VerbatimChar"/>
         </w:rPr>
-        <w:t xml:space="preserve">30.     if not (state.gnb_ips and old in state.gnb_ips and pkt[IP].src in state.gnb_ips):</w:t>
+        <w:t xml:space="preserve">30.         state.teid_owner[key] = outer.src      # handover, or the gNB reclaiming its tunnel</w:t>
       </w:r>
       <w:r>
         <w:br/>
@@ -3356,7 +3493,7 @@
         <w:rPr>
           <w:rStyle w:val="VerbatimChar"/>
         </w:rPr>
-        <w:t xml:space="preserve">31.         raise_finding('R2_TEID_SPOOF', high)    # else: legitimate Xn handover</w:t>
+        <w:t xml:space="preserve">31.     else: raise_finding('R2_TEID_SPOOF', high) # ownership is not transferred</w:t>
       </w:r>
       <w:r>
         <w:br/>
@@ -3626,18 +3763,18 @@
               <w:jc w:val="left"/>
             </w:pPr>
             <w:r>
-              <w:t xml:space="preserve">A known TEID arriving from a new source address, excluding transitions between known gNBs</w:t>
-            </w:r>
-          </w:p>
-        </w:tc>
-        <w:tc>
-          <w:p>
-            <w:pPr>
-              <w:pStyle w:val="Compact"/>
-              <w:jc w:val="left"/>
-            </w:pPr>
-            <w:r>
-              <w:t xml:space="preserve">TEID to current source; known-gNB allowlist</w:t>
+              <w:t xml:space="preserve">A known (receiving address, TEID) pair arriving from a source other than its owner, excluding a change to an allowlisted gNB</w:t>
+            </w:r>
+          </w:p>
+        </w:tc>
+        <w:tc>
+          <w:p>
+            <w:pPr>
+              <w:pStyle w:val="Compact"/>
+              <w:jc w:val="left"/>
+            </w:pPr>
+            <w:r>
+              <w:t xml:space="preserve">(Receiving address, TEID) to owning source; known-gNB allowlist</w:t>
             </w:r>
           </w:p>
         </w:tc>
@@ -3772,11 +3909,11 @@
       <w:pPr>
         <w:pStyle w:val="Heading4"/>
       </w:pPr>
-      <w:bookmarkStart w:id="41" w:name="r1-nested-gtp-tunnels"/>
+      <w:bookmarkStart w:id="43" w:name="r1-nested-gtp-tunnels"/>
       <w:r>
         <w:t xml:space="preserve">3.6.1. R1: nested GTP tunnels</w:t>
       </w:r>
-      <w:bookmarkEnd w:id="41"/>
+      <w:bookmarkEnd w:id="43"/>
     </w:p>
     <w:p>
       <w:pPr>
@@ -3790,18 +3927,18 @@
       <w:pPr>
         <w:pStyle w:val="Heading4"/>
       </w:pPr>
-      <w:bookmarkStart w:id="42" w:name="r2-teid-spoofing"/>
+      <w:bookmarkStart w:id="44" w:name="r2-teid-spoofing"/>
       <w:r>
         <w:t xml:space="preserve">3.6.2. R2: TEID spoofing</w:t>
       </w:r>
-      <w:bookmarkEnd w:id="42"/>
+      <w:bookmarkEnd w:id="44"/>
     </w:p>
     <w:p>
       <w:pPr>
         <w:pStyle w:val="FirstParagraph"/>
       </w:pPr>
       <w:r>
-        <w:t xml:space="preserve">R2 detects a TEID that is associated with one source address and then arrives from a different one. The first packet bearing a given TEID establishes its association; a later packet with the same TEID from a different source raises a finding and the association is updated to the new source. Updating rather than pinning the association matters: pinning causes an alarm on every subsequent packet of a long-lived flow once a single spoof has occurred, and it makes the measured finding count a function of packet ordering rather than of the number of ownership transitions.</w:t>
+        <w:t xml:space="preserve">R2 detects a TEID that is associated with one source address and then arrives from a different one. Because a TEID is unique only within the endpoint that receives it (3GPP TS 29.281), the association is keyed on the pair of receiving address, taken from the destination of the outer IPv4 or IPv6 header that carries the tunnel, and TEID, so the same number used on an uplink and on a downlink tunnel names two different tunnels. The first packet bearing a given pair establishes its owner, and the first source wins: a later packet on the same pair from a different source raises a finding and leaves ownership where it was. A rogue source therefore cannot take a tunnel over, and it cannot make the legitimate owner's next packet look like the spoof. An earlier version of the rule moved ownership to whichever source sent last and keyed it on the TEID alone; Section 4.9 records how the labelled live run exposed this as defect 7.</w:t>
       </w:r>
     </w:p>
     <w:p>
@@ -3809,18 +3946,18 @@
         <w:pStyle w:val="BodyText"/>
       </w:pPr>
       <w:r>
-        <w:t xml:space="preserve">The rule accepts an operator-supplied allowlist of known gNB addresses. When the allowlist is populated and both the previous and the new source are in it, the transition is treated as a legitimate Xn or N2 handover and suppressed; a TEID re-sourced from an address outside the pool still raises a finding. Section 4.5 reports the effect of this allowlist as an ablation rather than assuming it. The rule is deliberately simple, trading detection of sophisticated session-aware spoofing for logic that is auditable and easy to unit-test; the corresponding limitations, the absence of TEID ageing and the dependence on IP-based attribution, are stated in Sections 4.6 and 4.10.</w:t>
+        <w:t xml:space="preserve">The rule accepts an operator-supplied allowlist of known gNB addresses. When the allowlist is populated and the new source is in it, ownership moves to that gNB and no finding is raised. This covers a legitimate Xn or N2 handover, and it also lets the real gNB reclaim a tunnel that a rogue was seen on first, for example after a detector restart. A TEID re-sourced from an address outside the pool still raises a finding. Without the allowlist every change of source is flagged and ownership never moves, so a handed-over session keeps alerting for as long as it sends from the new gNB. Section 4.5 reports the effect of this allowlist as an ablation rather than assuming it. The rule is deliberately simple, trading detection of sophisticated session-aware spoofing for logic that is auditable and easy to unit-test; the corresponding limitations, the absence of TEID ageing and the dependence on IP-based attribution, are stated in Sections 4.6 and 4.10.</w:t>
       </w:r>
     </w:p>
     <w:p>
       <w:pPr>
         <w:pStyle w:val="Heading4"/>
       </w:pPr>
-      <w:bookmarkStart w:id="43" w:name="r3-control-plane-smuggling"/>
+      <w:bookmarkStart w:id="45" w:name="r3-control-plane-smuggling"/>
       <w:r>
         <w:t xml:space="preserve">3.6.3. R3: control-plane smuggling</w:t>
       </w:r>
-      <w:bookmarkEnd w:id="43"/>
+      <w:bookmarkEnd w:id="45"/>
     </w:p>
     <w:p>
       <w:pPr>
@@ -3834,11 +3971,11 @@
       <w:pPr>
         <w:pStyle w:val="Heading4"/>
       </w:pPr>
-      <w:bookmarkStart w:id="44" w:name="r4-inner-traffic-to-a-core-function"/>
+      <w:bookmarkStart w:id="46" w:name="r4-inner-traffic-to-a-core-function"/>
       <w:r>
         <w:t xml:space="preserve">3.6.4. R4: inner traffic to a core function</w:t>
       </w:r>
-      <w:bookmarkEnd w:id="44"/>
+      <w:bookmarkEnd w:id="46"/>
     </w:p>
     <w:p>
       <w:pPr>
@@ -3852,18 +3989,18 @@
       <w:pPr>
         <w:pStyle w:val="Heading3"/>
       </w:pPr>
-      <w:bookmarkStart w:id="45" w:name="Xe0fb3ea3cc832818018e350fe4762c01a00605a"/>
+      <w:bookmarkStart w:id="47" w:name="Xe0fb3ea3cc832818018e350fe4762c01a00605a"/>
       <w:r>
         <w:t xml:space="preserve">3.7. Payload re-parsing for nested-tunnel detection</w:t>
       </w:r>
-      <w:bookmarkEnd w:id="45"/>
+      <w:bookmarkEnd w:id="47"/>
     </w:p>
     <w:p>
       <w:pPr>
         <w:pStyle w:val="FirstParagraph"/>
       </w:pPr>
       <w:r>
-        <w:t xml:space="preserve">The most consequential implementation detail in the detector, and the primary technical finding of the study, concerns how a payload is dissected before any rule is evaluated. Scapy decides how to parse a GTP-U payload by inspecting its first nibble, expecting IPv4 (0x4) or IPv6 (0x6). A nested GTP header begins with a byte in the 0x30 to 0x3f range, which matches neither, so the parser falls back to treating the whole inner payload as opaque bytes. A detector that checks whether the GTP-U payload contains a further GTP header, using the parser's own layer list on captured or live traffic, therefore obtains a negative result for every genuine nested-tunnel packet, because the parser has already discarded the structure required to see it.</w:t>
+        <w:t xml:space="preserve">The most consequential implementation detail in the detector, and the primary technical finding of the study, concerns how a payload is dissected before any rule is evaluated. Scapy decides how to parse a GTP-U payload by inspecting its first nibble, expecting IPv4 (0x4) or IPv6 (0x6). A nested GTP header begins with a byte in the 0x30 to 0x3f range, which matches neither, so the parser does not decode it as GTP (Fig. 3). Beneath a bare outer header with message type 0x00 it treats the whole inner payload as opaque bytes (IP / UDP / GTP-U / Raw); inside a realistic outer G-PDU it guesses the nested bytes as PPP (IP / UDP / GTP-U / PPP / Raw). A detector that checks whether the GTP-U payload contains a further GTP header, using the parser's own layer list on captured or live traffic, therefore obtains a negative result for every genuine nested-tunnel packet, because the parser has already discarded the structure required to see it.</w:t>
       </w:r>
     </w:p>
     <w:p>
@@ -3879,7 +4016,7 @@
         <w:pStyle w:val="BodyText"/>
       </w:pPr>
       <w:r>
-        <w:t xml:space="preserve">The fix, illustrated in Fig. 3, re-interprets an opaque payload found beneath a GTP-U layer. The gate is five conditions rather than three, and the additional two are not cosmetic. Version 1, the protocol-type bit and a known message type are the obvious tests, but they are weak: a GTP message type is a single byte, and 0x30–0x3f is one sixteenth of the first-byte space, so arbitrary non-IP payloads collide with the pattern at a non-negligible rate. The gate therefore also requires that the 16-bit length field at bytes 2–3 be consistent with the number of bytes actually present, allowing at most four bytes of trailing padding, and that a G-PDU message type declare a length large enough to contain an IP header. R1 then applies a sixth condition after re-parsing, requiring a routable inner IP packet beneath the nested header. The re-parse operates on the inner payload's raw bytes rather than on whichever class the default parser assigned to them, and this is not a nicety. Which class Scapy guesses depends on the outer message type: inside a realistic outer G-PDU, the form a UPF actually decapsulates, Scapy guesses the nested bytes as PPP rather than as opaque Raw. An earlier version of the rule that re-read only Raw payloads therefore missed exactly this realistic case, and did so silently, until a probe capture built with a valid outer message type exposed it. That the fix was found by running realistic wire bytes through the detector, and not by any in-memory test, is itself an instance of the argument in Section 4.9.</w:t>
+        <w:t xml:space="preserve">The fix, shown as a pipeline in Fig. 2, keeps a payload beneath a GTP-U layer that Scapy already decoded as IPv4, IPv6 or a GTP header, and re-checks any other payload on its raw bytes, re-dissecting it as GTP-U when it passes a plausibility gate. The gate is five conditions rather than three, and the additional two are not cosmetic. Version 1, the protocol-type bit and a known message type are the obvious tests, but they are weak: a GTP message type is a single byte, and 0x30–0x3f is one sixteenth of the first-byte space, so arbitrary non-IP payloads collide with the pattern at a non-negligible rate. The gate therefore also requires that the 16-bit length field at bytes 2–3 be consistent with the number of bytes actually present, allowing at most four bytes of trailing padding, and that a G-PDU message type declare a length large enough to contain an IP header. R1 then applies a sixth condition after re-parsing, requiring a routable inner IP packet beneath the nested header. The re-parse operates on the inner payload's raw bytes rather than on whichever class the default parser assigned to them, and this is not a nicety. Which class Scapy guesses depends on the outer message type: inside a realistic outer G-PDU, the form a UPF actually decapsulates, Scapy guesses the nested bytes as PPP rather than as opaque Raw. An earlier version of the rule that re-read only Raw payloads therefore missed exactly this realistic case, and did so silently, until a probe capture built with a valid outer message type exposed it. That the fix was found by running realistic wire bytes through the detector, and not by any in-memory test, is itself an instance of the argument in Section 4.9.</w:t>
       </w:r>
     </w:p>
     <w:p>
@@ -3910,7 +4047,62 @@
         <w:pStyle w:val="BodyText"/>
       </w:pPr>
       <w:r>
-        <w:t xml:space="preserve">As far as the authors are aware this is an under-documented requirement for any Scapy-based passive GTP-U tool, and it generalises. A passive detector built by testing against in-memory packet objects rather than against re-parsed wire bytes can silently miss precisely the abuse class that depends on a parser's fallback behaviour; and a re-parse heuristic validated only against a benign class that contains no non-IP payloads will not reveal the false positives it introduces. Section 4.9 extends this point with five further concrete instances found in the same project's deployment code.</w:t>
+        <w:t xml:space="preserve">As far as the authors are aware this is an under-documented requirement for any Scapy-based passive GTP-U tool, and it generalises. A passive detector built by testing against in-memory packet objects rather than against re-parsed wire bytes can silently miss precisely the abuse class that depends on a parser's fallback behaviour; and a re-parse heuristic validated only against a benign class that contains no non-IP payloads will not reveal the false positives it introduces. Section 4.9 extends this point with seven further concrete instances, six in the same project's deployment code and one in its detection logic.</w:t>
+      </w:r>
+    </w:p>
+    <w:p>
+      <w:pPr>
+        <w:pStyle w:val="CaptionedFigure"/>
+      </w:pPr>
+      <w:r>
+        <w:drawing>
+          <wp:inline>
+            <wp:extent cx="5334000" cy="2189328"/>
+            <wp:effectExtent b="0" l="0" r="0" t="0"/>
+            <wp:docPr descr="Conformant GTP-U and the nested and plane-crossing constructions under default dissection" title="" id="1" name="Picture"/>
+            <a:graphic>
+              <a:graphicData uri="http://schemas.openxmlformats.org/drawingml/2006/picture">
+                <pic:pic>
+                  <pic:nvPicPr>
+                    <pic:cNvPr descr="figures/manuscript/image2.png" id="0" name="Picture"/>
+                    <pic:cNvPicPr>
+                      <a:picLocks noChangeArrowheads="1" noChangeAspect="1"/>
+                    </pic:cNvPicPr>
+                  </pic:nvPicPr>
+                  <pic:blipFill>
+                    <a:blip r:embed="rId48"/>
+                    <a:stretch>
+                      <a:fillRect/>
+                    </a:stretch>
+                  </pic:blipFill>
+                  <pic:spPr bwMode="auto">
+                    <a:xfrm>
+                      <a:off x="0" y="0"/>
+                      <a:ext cx="5334000" cy="2189328"/>
+                    </a:xfrm>
+                    <a:prstGeom prst="rect">
+                      <a:avLst/>
+                    </a:prstGeom>
+                    <a:noFill/>
+                    <a:ln w="9525">
+                      <a:noFill/>
+                      <a:headEnd/>
+                      <a:tailEnd/>
+                    </a:ln>
+                  </pic:spPr>
+                </pic:pic>
+              </a:graphicData>
+            </a:graphic>
+          </wp:inline>
+        </w:drawing>
+      </w:r>
+    </w:p>
+    <w:p>
+      <w:pPr>
+        <w:pStyle w:val="ImageCaption"/>
+      </w:pPr>
+      <w:r>
+        <w:t xml:space="preserve">Conformant GTP-U and the nested and plane-crossing constructions under default dissection</w:t>
       </w:r>
     </w:p>
     <w:p>
@@ -3927,18 +4119,18 @@
         <w:t xml:space="preserve"> </w:t>
       </w:r>
       <w:r>
-        <w:t xml:space="preserve">Dissection of a nested GTP-U packet: (a) default parsing discards the inner structure; (b) payload re-parsing recovers it.</w:t>
+        <w:t xml:space="preserve">Conformant GTP-U compared with three abusive constructions. Default dissection never decodes the bare nested header (b) as GTP-U: it is guessed as PPP under a G-PDU outer header, or left as Raw under one of message type 0x00. The payload re-parse of Section 3.7 recovers it. The IP-wrapped form (c) decodes natively.</w:t>
       </w:r>
     </w:p>
     <w:p>
       <w:pPr>
         <w:pStyle w:val="Heading3"/>
       </w:pPr>
-      <w:bookmarkStart w:id="46" w:name="performance-examination-of-the-model"/>
+      <w:bookmarkStart w:id="49" w:name="performance-examination-of-the-model"/>
       <w:r>
         <w:t xml:space="preserve">3.8. Performance examination of the model</w:t>
       </w:r>
-      <w:bookmarkEnd w:id="46"/>
+      <w:bookmarkEnd w:id="49"/>
     </w:p>
     <w:p>
       <w:pPr>
@@ -4053,18 +4245,18 @@
         <w:t xml:space="preserve">both dissection and rule evaluation</w:t>
       </w:r>
       <w:r>
-        <w:t xml:space="preserve">, because a passive tap must pay both. This is stated explicitly because timing rule evaluation alone is a natural implementation choice and a materially misleading one: on the corpus of Table 3, dissection accounts for roughly 76% of per-packet cost, so a harness that starts its timer after dissection overstates sustained throughput by a factor of about four. Latency percentiles are also reported, because a mean alone conceals the tail behaviour that determines whether a passive tap keeps pace with a live interface.</w:t>
+        <w:t xml:space="preserve">, because a passive tap must pay both. This is stated explicitly because timing rule evaluation alone is a natural implementation choice and a materially misleading one: on the corpus of Table 3, dissection accounts for roughly 76% of per-packet cost, so a harness that starts its timer after dissection overstates sustained throughput by a factor of three to four: the earlier rules-only harness measured about 206 µs per packet (about 4,850 packets per second) against 686 µs (about 1,450) for the full cycle (Section 4.8). Latency percentiles are also reported, because a mean alone conceals the tail behaviour that determines whether a passive tap keeps pace with a live interface.</w:t>
       </w:r>
     </w:p>
     <w:p>
       <w:pPr>
         <w:pStyle w:val="Heading3"/>
       </w:pPr>
-      <w:bookmarkStart w:id="47" w:name="ethics-and-responsible-use"/>
+      <w:bookmarkStart w:id="50" w:name="ethics-and-responsible-use"/>
       <w:r>
         <w:t xml:space="preserve">3.9. Ethics and responsible use</w:t>
       </w:r>
-      <w:bookmarkEnd w:id="47"/>
+      <w:bookmarkEnd w:id="50"/>
     </w:p>
     <w:p>
       <w:pPr>
@@ -4085,21 +4277,21 @@
       <w:pPr>
         <w:pStyle w:val="Heading2"/>
       </w:pPr>
-      <w:bookmarkStart w:id="48" w:name="results-and-discussion"/>
+      <w:bookmarkStart w:id="51" w:name="results-and-discussion"/>
       <w:r>
         <w:t xml:space="preserve">4. Results and discussion</w:t>
       </w:r>
-      <w:bookmarkEnd w:id="48"/>
+      <w:bookmarkEnd w:id="51"/>
     </w:p>
     <w:p>
       <w:pPr>
         <w:pStyle w:val="Heading3"/>
       </w:pPr>
-      <w:bookmarkStart w:id="49" w:name="results"/>
+      <w:bookmarkStart w:id="52" w:name="results"/>
       <w:r>
         <w:t xml:space="preserve">4.1. Results</w:t>
       </w:r>
-      <w:bookmarkEnd w:id="49"/>
+      <w:bookmarkEnd w:id="52"/>
     </w:p>
     <w:p>
       <w:pPr>
@@ -4113,11 +4305,11 @@
       <w:pPr>
         <w:pStyle w:val="Heading3"/>
       </w:pPr>
-      <w:bookmarkStart w:id="50" w:name="experimental-setup"/>
+      <w:bookmarkStart w:id="53" w:name="experimental-setup"/>
       <w:r>
         <w:t xml:space="preserve">4.2. Experimental setup</w:t>
       </w:r>
-      <w:bookmarkEnd w:id="50"/>
+      <w:bookmarkEnd w:id="53"/>
     </w:p>
     <w:p>
       <w:pPr>
@@ -4147,10 +4339,13 @@
     <w:tbl>
       <w:tblPr>
         <w:tblStyle w:val="Table"/>
-        <w:tblW w:type="pct" w:w="0.0"/>
+        <w:tblW w:type="pct" w:w="5000.0"/>
         <w:tblLook w:firstRow="1"/>
       </w:tblPr>
-      <w:tblGrid/>
+      <w:tblGrid>
+        <w:gridCol w:w="3960"/>
+        <w:gridCol w:w="3960"/>
+      </w:tblGrid>
       <w:tr>
         <w:trPr>
           <w:cnfStyle w:firstRow="1"/>
@@ -4209,7 +4404,7 @@
               <w:jc w:val="left"/>
             </w:pPr>
             <w:r>
-              <w:t xml:space="preserve">Ubuntu (kernel 6.8.0-134)</w:t>
+              <w:t xml:space="preserve">Ubuntu (kernel 6.8.0-134; 6.8.0-138 for the re-run after the R2 fix and the labelled live run)</w:t>
             </w:r>
           </w:p>
         </w:tc>
@@ -4233,7 +4428,7 @@
               <w:jc w:val="left"/>
             </w:pPr>
             <w:r>
-              <w:t xml:space="preserve">3.12.13</w:t>
+              <w:t xml:space="preserve">3.10.12</w:t>
             </w:r>
           </w:p>
         </w:tc>
@@ -4257,6 +4452,75 @@
               <w:jc w:val="left"/>
             </w:pPr>
             <w:r>
+              <w:t xml:space="preserve">2.4.4 (Ubuntu</w:t>
+            </w:r>
+            <w:r>
+              <w:t xml:space="preserve"> </w:t>
+            </w:r>
+            <w:r>
+              <w:rPr>
+                <w:rStyle w:val="VerbatimChar"/>
+              </w:rPr>
+              <w:t xml:space="preserve">python3-scapy</w:t>
+            </w:r>
+            <w:r>
+              <w:t xml:space="preserve">)</w:t>
+            </w:r>
+          </w:p>
+        </w:tc>
+      </w:tr>
+      <w:tr>
+        <w:tc>
+          <w:p>
+            <w:pPr>
+              <w:pStyle w:val="Compact"/>
+              <w:jc w:val="left"/>
+            </w:pPr>
+            <w:r>
+              <w:t xml:space="preserve">Python (detector container)</w:t>
+            </w:r>
+          </w:p>
+        </w:tc>
+        <w:tc>
+          <w:p>
+            <w:pPr>
+              <w:pStyle w:val="Compact"/>
+              <w:jc w:val="left"/>
+            </w:pPr>
+            <w:r>
+              <w:t xml:space="preserve">3.12 (</w:t>
+            </w:r>
+            <w:r>
+              <w:rPr>
+                <w:rStyle w:val="VerbatimChar"/>
+              </w:rPr>
+              <w:t xml:space="preserve">python:3.12-slim</w:t>
+            </w:r>
+            <w:r>
+              <w:t xml:space="preserve">; 3.12.14 in the rebuild used for the labelled live runs)</w:t>
+            </w:r>
+          </w:p>
+        </w:tc>
+      </w:tr>
+      <w:tr>
+        <w:tc>
+          <w:p>
+            <w:pPr>
+              <w:pStyle w:val="Compact"/>
+              <w:jc w:val="left"/>
+            </w:pPr>
+            <w:r>
+              <w:t xml:space="preserve">Scapy (detector container)</w:t>
+            </w:r>
+          </w:p>
+        </w:tc>
+        <w:tc>
+          <w:p>
+            <w:pPr>
+              <w:pStyle w:val="Compact"/>
+              <w:jc w:val="left"/>
+            </w:pPr>
+            <w:r>
               <w:t xml:space="preserve">2.7.0</w:t>
             </w:r>
           </w:p>
@@ -4270,54 +4534,6 @@
               <w:jc w:val="left"/>
             </w:pPr>
             <w:r>
-              <w:t xml:space="preserve">Python (detector container)</w:t>
-            </w:r>
-          </w:p>
-        </w:tc>
-        <w:tc>
-          <w:p>
-            <w:pPr>
-              <w:pStyle w:val="Compact"/>
-              <w:jc w:val="left"/>
-            </w:pPr>
-            <w:r>
-              <w:t xml:space="preserve">3.12.13</w:t>
-            </w:r>
-          </w:p>
-        </w:tc>
-      </w:tr>
-      <w:tr>
-        <w:tc>
-          <w:p>
-            <w:pPr>
-              <w:pStyle w:val="Compact"/>
-              <w:jc w:val="left"/>
-            </w:pPr>
-            <w:r>
-              <w:t xml:space="preserve">Scapy (detector container)</w:t>
-            </w:r>
-          </w:p>
-        </w:tc>
-        <w:tc>
-          <w:p>
-            <w:pPr>
-              <w:pStyle w:val="Compact"/>
-              <w:jc w:val="left"/>
-            </w:pPr>
-            <w:r>
-              <w:t xml:space="preserve">2.7.0</w:t>
-            </w:r>
-          </w:p>
-        </w:tc>
-      </w:tr>
-      <w:tr>
-        <w:tc>
-          <w:p>
-            <w:pPr>
-              <w:pStyle w:val="Compact"/>
-              <w:jc w:val="left"/>
-            </w:pPr>
-            <w:r>
               <w:t xml:space="preserve">Open5GS</w:t>
             </w:r>
           </w:p>
@@ -4412,7 +4628,7 @@
         <w:pStyle w:val="BodyText"/>
       </w:pPr>
       <w:r>
-        <w:t xml:space="preserve">Before evaluation, the detector's unit suite was executed and all twenty-one tests passed across five files: one test per rule plus a benign-traffic negative case, a two-packet TEID-spoof sequence and a malformed-packet robustness check confirming that the dispatcher survives garbage input, and, added after a realistic-outer probe exposed the gap, a nested tunnel inside a valid G-PDU outer plus a benign G-PDU that must stay silent (</w:t>
+        <w:t xml:space="preserve">Before evaluation, the detector's unit suite was executed and all twenty-four tests passed across five files: one test per rule plus a benign-traffic negative case, a two-packet TEID-spoof sequence and a malformed-packet robustness check confirming that the dispatcher survives garbage input; added after a realistic-outer probe exposed the gap, a nested tunnel inside a valid G-PDU outer plus a benign G-PDU that must stay silent; and, added with the R2 fix of Section 4.9, spoofs interleaved with the owner's traffic on one TEID that must all be flagged while the owner never is, the same TEID number on an uplink and a downlink tunnel that must not conflict, and the exact live corpus of Section 4.7, which must score with no false positive and no false negative (</w:t>
       </w:r>
       <w:r>
         <w:rPr>
@@ -4421,7 +4637,7 @@
         <w:t xml:space="preserve">test_rules.py</w:t>
       </w:r>
       <w:r>
-        <w:t xml:space="preserve">, nine tests); zero false positives on the realistic benign corpus, attribution of every residual false positive without the gNB allowlist to handovers, and no flagging of Unstructured-PDU bytes across 200 adversarial payloads (</w:t>
+        <w:t xml:space="preserve">, twelve tests); zero false positives on the realistic benign corpus, attribution of every residual false positive without the gNB allowlist to handovers, and no flagging of Unstructured-PDU bytes across 200 adversarial payloads (</w:t>
       </w:r>
       <w:r>
         <w:rPr>
@@ -4439,7 +4655,7 @@
         <w:t xml:space="preserve">test_evasions.py</w:t>
       </w:r>
       <w:r>
-        <w:t xml:space="preserve">, two tests); a demonstration that the naive default-dissection detector misses GTP-in-GTP that the robust detector catches (</w:t>
+        <w:t xml:space="preserve">, two tests); a demonstration that the naive default-dissection detector misses GTP-in-GTP that the robust detector catches, and that the two agree on the rules that need no re-parse, now including R2 on interleaved spoofs (</w:t>
       </w:r>
       <w:r>
         <w:rPr>
@@ -4457,7 +4673,7 @@
         <w:t xml:space="preserve">test_reproducibility.py</w:t>
       </w:r>
       <w:r>
-        <w:t xml:space="preserve">, three tests). The significance of a fully green suite is revisited in Section 4.9.</w:t>
+        <w:t xml:space="preserve">, three tests). The three new R2 tests and the extended baseline test fail on the old R2 code and pass on the fixed code. The significance of a fully green suite is revisited in Section 4.9.</w:t>
       </w:r>
     </w:p>
     <w:p>
@@ -4483,11 +4699,11 @@
       <w:pPr>
         <w:pStyle w:val="Heading3"/>
       </w:pPr>
-      <w:bookmarkStart w:id="51" w:name="offline-evaluation-on-the-seeded-corpus"/>
+      <w:bookmarkStart w:id="54" w:name="offline-evaluation-on-the-seeded-corpus"/>
       <w:r>
         <w:t xml:space="preserve">4.3. Offline evaluation on the seeded corpus</w:t>
       </w:r>
-      <w:bookmarkEnd w:id="51"/>
+      <w:bookmarkEnd w:id="54"/>
     </w:p>
     <w:p>
       <w:pPr>
@@ -4803,7 +5019,7 @@
                     </pic:cNvPicPr>
                   </pic:nvPicPr>
                   <pic:blipFill>
-                    <a:blip r:embed="rId52"/>
+                    <a:blip r:embed="rId55"/>
                     <a:stretch>
                       <a:fillRect/>
                     </a:stretch>
@@ -5694,25 +5910,25 @@
         <w:pStyle w:val="BodyText"/>
       </w:pPr>
       <w:r>
-        <w:t xml:space="preserve">R1 fires exactly once per nested-tunnel packet. R2 fires exactly once per spoof, because each spoof reuses a distinct victim TEID whose ownership was established earlier in the corpus, so no ownership oscillation occurs. R3 fires on both the PFCP-smuggle and NGAP-smuggle classes, 240 packets in total. R4 is the broadest rule on this corpus at 360 findings, because inner destinations belonging to the configured core address set occur in the inner-to-core class and also, by construction, in the PFCP-smuggle and NGAP-smuggle classes, whose inner packets are addressed to the UPF. R4 is therefore also the rule most dependent on configuration, as Section 4.6 demonstrates directly.</w:t>
+        <w:t xml:space="preserve">R1 fires exactly once per nested-tunnel packet. R2 fires exactly once per spoof, because each spoof reuses a distinct victim TEID whose owner was established earlier in the corpus. The same construction is why this corpus could not expose the R2 ownership defect recorded as defect 7 in Section 4.9, and why the fix leaves every offline result in this section unchanged. R3 fires on both the PFCP-smuggle and NGAP-smuggle classes, 240 packets in total. R4 is the broadest rule on this corpus at 360 findings, because inner destinations belonging to the configured core address set occur in the inner-to-core class and also, by construction, in the PFCP-smuggle and NGAP-smuggle classes, whose inner packets are addressed to the UPF. R4 is therefore also the rule most dependent on configuration, as Section 4.6 demonstrates directly.</w:t>
       </w:r>
     </w:p>
     <w:p>
       <w:pPr>
         <w:pStyle w:val="Heading3"/>
       </w:pPr>
-      <w:bookmarkStart w:id="53" w:name="X2f6dd905036150bbfed019340e438d953db250b"/>
+      <w:bookmarkStart w:id="56" w:name="X2f6dd905036150bbfed019340e438d953db250b"/>
       <w:r>
         <w:t xml:space="preserve">4.4. Effect of payload re-parsing, and the naive baseline</w:t>
       </w:r>
-      <w:bookmarkEnd w:id="53"/>
+      <w:bookmarkEnd w:id="56"/>
     </w:p>
     <w:p>
       <w:pPr>
         <w:pStyle w:val="FirstParagraph"/>
       </w:pPr>
       <w:r>
-        <w:t xml:space="preserve">To isolate the contribution of Section 3.7, the detector was compared against a naive baseline that holds every other design decision constant, the same four rule ideas, the same state model, the same corpus, and differs only in using Scapy's default dissection with no byte-level re-interpretation of opaque payloads. Table 10 reports the result and Fig. 6 shows the R1 detection rate under each.</w:t>
+        <w:t xml:space="preserve">To isolate the contribution of Section 3.7, the detector was compared against a naive baseline that holds every other design decision constant, the same four rule ideas, the same state model, the same corpus, and differs only in using Scapy's default dissection with no byte-level re-interpretation of opaque payloads. Table 10 reports the result and Fig. 5 shows the R1 detection rate under each.</w:t>
       </w:r>
     </w:p>
     <w:p>
@@ -6134,7 +6350,7 @@
                     </pic:cNvPicPr>
                   </pic:nvPicPr>
                   <pic:blipFill>
-                    <a:blip r:embed="rId54"/>
+                    <a:blip r:embed="rId57"/>
                     <a:stretch>
                       <a:fillRect/>
                     </a:stretch>
@@ -6177,7 +6393,7 @@
         <w:rPr>
           <w:b/>
         </w:rPr>
-        <w:t xml:space="preserve">Fig. 6.</w:t>
+        <w:t xml:space="preserve">Fig. 5.</w:t>
       </w:r>
       <w:r>
         <w:t xml:space="preserve"> </w:t>
@@ -6213,18 +6429,18 @@
       <w:pPr>
         <w:pStyle w:val="Heading3"/>
       </w:pPr>
-      <w:bookmarkStart w:id="55" w:name="false-positive-ablation"/>
+      <w:bookmarkStart w:id="58" w:name="false-positive-ablation"/>
       <w:r>
         <w:t xml:space="preserve">4.5. False-positive ablation</w:t>
       </w:r>
-      <w:bookmarkEnd w:id="55"/>
+      <w:bookmarkEnd w:id="58"/>
     </w:p>
     <w:p>
       <w:pPr>
         <w:pStyle w:val="FirstParagraph"/>
       </w:pPr>
       <w:r>
-        <w:t xml:space="preserve">Table 11 reports the only configuration in which the detector produces false positives on this corpus, and attributes every one of them.</w:t>
+        <w:t xml:space="preserve">Table 11 and Fig. 6 report the only configuration in which the detector produces false positives on this corpus, and attribute every one of them.</w:t>
       </w:r>
     </w:p>
     <w:p>
@@ -6429,7 +6645,7 @@
               <w:jc w:val="left"/>
             </w:pPr>
             <w:r>
-              <w:t xml:space="preserve">,</w:t>
+              <w:t xml:space="preserve">None</w:t>
             </w:r>
           </w:p>
         </w:tc>
@@ -6455,7 +6671,7 @@
                     </pic:cNvPicPr>
                   </pic:nvPicPr>
                   <pic:blipFill>
-                    <a:blip r:embed="rId56"/>
+                    <a:blip r:embed="rId59"/>
                     <a:stretch>
                       <a:fillRect/>
                     </a:stretch>
@@ -6498,7 +6714,7 @@
         <w:rPr>
           <w:b/>
         </w:rPr>
-        <w:t xml:space="preserve">Fig. 8.</w:t>
+        <w:t xml:space="preserve">Fig. 6.</w:t>
       </w:r>
       <w:r>
         <w:t xml:space="preserve"> </w:t>
@@ -6512,18 +6728,18 @@
         <w:pStyle w:val="BodyText"/>
       </w:pPr>
       <w:r>
-        <w:t xml:space="preserve">Without the allowlist, R2 flags the second packet of each of the six two-packet handover pairs, because the same uplink TEID arrives from a new source address. This is not a defect in the rule so much as a statement of what a user-plane-only view can and cannot resolve: on N3 alone, an Xn handover and a TEID spoof are the same event. Supplying the operator's known-gNB set resolves it, because a handover moves a TEID between two addresses that are both in the set while a spoof moves it to an address that is not. The mitigation is therefore an operator input rather than a cleverer heuristic, and its dependence on a complete and current gNB inventory is a deployment cost, stated in Section 4.10.</w:t>
+        <w:t xml:space="preserve">Without the allowlist, R2 flags the second packet of each of the six two-packet handover pairs, because the same uplink TEID arrives from a new source address. This is not a defect in the rule so much as a statement of what a user-plane-only view can and cannot resolve: on N3 alone, an Xn handover and a TEID spoof are the same event. Supplying the operator's known-gNB set resolves it, because a handover moves a TEID between two addresses that are both in the set while a spoof re-sources it from an address that is not. The mitigation is therefore an operator input rather than a cleverer heuristic, and its dependence on a complete and current gNB inventory is a deployment cost, stated in Section 4.10.</w:t>
       </w:r>
     </w:p>
     <w:p>
       <w:pPr>
         <w:pStyle w:val="Heading3"/>
       </w:pPr>
-      <w:bookmarkStart w:id="57" w:name="adversarial-robustness-the-evasion-suite"/>
+      <w:bookmarkStart w:id="60" w:name="adversarial-robustness-the-evasion-suite"/>
       <w:r>
         <w:t xml:space="preserve">4.6. Adversarial robustness: the evasion suite</w:t>
       </w:r>
-      <w:bookmarkEnd w:id="57"/>
+      <w:bookmarkEnd w:id="60"/>
     </w:p>
     <w:p>
       <w:pPr>
@@ -7371,18 +7587,42 @@
       <w:pPr>
         <w:pStyle w:val="Heading3"/>
       </w:pPr>
-      <w:bookmarkStart w:id="58" w:name="live-full-stack-validation"/>
+      <w:bookmarkStart w:id="61" w:name="live-full-stack-validation"/>
       <w:r>
         <w:t xml:space="preserve">4.7. Live full-stack validation</w:t>
       </w:r>
-      <w:bookmarkEnd w:id="58"/>
+      <w:bookmarkEnd w:id="61"/>
     </w:p>
     <w:p>
       <w:pPr>
         <w:pStyle w:val="FirstParagraph"/>
       </w:pPr>
       <w:r>
-        <w:t xml:space="preserve">Unlike Section 4.3, the traffic in this experiment was never written to a file and replayed. A real UERANSIM handset completed a real NGAP and NAS registration and established a PDU session against a real Open5GS core, all in Docker, with the detector sniffing the shared interface inside the core's network namespace. Bring-up reached the following states in order: SCTP connection established, NG Setup successful, initial registration successful, PDU session established, and finally the tunnel interface came up with address 10.45.0.2. A ping of an external address through that interface returned three replies out of three, confirming that real ICMP traffic crossed the handset, the base station, N3, the UPF and the external network and back, and that the detector remained silent on it.</w:t>
+        <w:t xml:space="preserve">Unlike Section 4.3, the traffic the detector saw in this experiment was never written to a file and replayed. A real UERANSIM handset completed a real NGAP and NAS registration and established an IPv4 PDU session against a real Open5GS core, all in Docker, with the detector sniffing the shared interface inside the core's network namespace. Bring-up reached the following states in order: SCTP connection established, NG Setup successful, initial registration successful, PDU session established, and finally the tunnel interface came up with address 10.45.0.2. A ping sent through that interface to an external address (</w:t>
+      </w:r>
+      <w:r>
+        <w:rPr>
+          <w:rStyle w:val="VerbatimChar"/>
+        </w:rPr>
+        <w:t xml:space="preserve">ping -I uesimtun0 -c3 8.8.8.8</w:t>
+      </w:r>
+      <w:r>
+        <w:t xml:space="preserve">) returned three replies out of three. A capture on the core's interface during the ping showed each request arriving as uplink GTP-U from the gNB (10.10.10.20) to the UPF (10.10.10.10), the ICMP decapsulated on the UPF's tunnel device and translated out to the external network, and each reply returning as downlink GTP-U from the UPF to the gNB. Real ICMP traffic therefore crossed the handset, the base station, N3, the UPF and the external network and back, and the detector counted these packets and raised no findings on them. The session's TEIDs were 0xb2aa uplink and 0x1 downlink. An earlier version of this check, run through the</w:t>
+      </w:r>
+      <w:r>
+        <w:t xml:space="preserve"> </w:t>
+      </w:r>
+      <w:r>
+        <w:rPr>
+          <w:rStyle w:val="VerbatimChar"/>
+        </w:rPr>
+        <w:t xml:space="preserve">nr-binder</w:t>
+      </w:r>
+      <w:r>
+        <w:t xml:space="preserve"> </w:t>
+      </w:r>
+      <w:r>
+        <w:t xml:space="preserve">helper, also returned three replies but never used the tunnel; defect 6 in Section 4.9 records why.</w:t>
       </w:r>
     </w:p>
     <w:p>
@@ -7390,7 +7630,85 @@
         <w:pStyle w:val="BodyText"/>
       </w:pPr>
       <w:r>
-        <w:t xml:space="preserve">A 500-packet attack corpus, 400 malicious and 100 benign, was then transmitted at the UPF over a real socket. The passive detector, inside the core namespace, produced 131 findings with no crashes. Table 13 reports the distribution across the four rules.</w:t>
+        <w:t xml:space="preserve">A 500-packet attack corpus, 400 malicious and 100 benign, was then transmitted at the UPF over a real socket by the attack generator described in Section 3.3, which writes crafted GTP-U onto the core's N3 interface and is not a handset; the radio simulator does not encapsulate these packets. The corpus is seeded (1337) and identical on every run: 100 benign, 88</w:t>
+      </w:r>
+      <w:r>
+        <w:t xml:space="preserve"> </w:t>
+      </w:r>
+      <w:r>
+        <w:rPr>
+          <w:rStyle w:val="VerbatimChar"/>
+        </w:rPr>
+        <w:t xml:space="preserve">teid_spoof</w:t>
+      </w:r>
+      <w:r>
+        <w:t xml:space="preserve">, 82</w:t>
+      </w:r>
+      <w:r>
+        <w:t xml:space="preserve"> </w:t>
+      </w:r>
+      <w:r>
+        <w:rPr>
+          <w:rStyle w:val="VerbatimChar"/>
+        </w:rPr>
+        <w:t xml:space="preserve">gtp_in_gtp</w:t>
+      </w:r>
+      <w:r>
+        <w:t xml:space="preserve">, 80</w:t>
+      </w:r>
+      <w:r>
+        <w:t xml:space="preserve"> </w:t>
+      </w:r>
+      <w:r>
+        <w:rPr>
+          <w:rStyle w:val="VerbatimChar"/>
+        </w:rPr>
+        <w:t xml:space="preserve">inner_to_core</w:t>
+      </w:r>
+      <w:r>
+        <w:t xml:space="preserve">, 79</w:t>
+      </w:r>
+      <w:r>
+        <w:t xml:space="preserve"> </w:t>
+      </w:r>
+      <w:r>
+        <w:rPr>
+          <w:rStyle w:val="VerbatimChar"/>
+        </w:rPr>
+        <w:t xml:space="preserve">pfcp_smuggle</w:t>
+      </w:r>
+      <w:r>
+        <w:t xml:space="preserve"> </w:t>
+      </w:r>
+      <w:r>
+        <w:t xml:space="preserve">and 71</w:t>
+      </w:r>
+      <w:r>
+        <w:t xml:space="preserve"> </w:t>
+      </w:r>
+      <w:r>
+        <w:rPr>
+          <w:rStyle w:val="VerbatimChar"/>
+        </w:rPr>
+        <w:t xml:space="preserve">ngap_smuggle</w:t>
+      </w:r>
+      <w:r>
+        <w:t xml:space="preserve"> </w:t>
+      </w:r>
+      <w:r>
+        <w:t xml:space="preserve">packets. Every packet uses TEID 0x1 and outer destination 10.10.10.10, the UPF; the outer source is the gNB address 10.10.10.20 except for</w:t>
+      </w:r>
+      <w:r>
+        <w:t xml:space="preserve"> </w:t>
+      </w:r>
+      <w:r>
+        <w:rPr>
+          <w:rStyle w:val="VerbatimChar"/>
+        </w:rPr>
+        <w:t xml:space="preserve">teid_spoof</w:t>
+      </w:r>
+      <w:r>
+        <w:t xml:space="preserve">, which uses the rogue address 10.10.10.66. The send takes about 17 minutes, because from inside the core's own namespace Scapy cannot resolve a hardware address for the UPF address and sends each frame as a broadcast; the detector, sniffing the same interface, sees the frames regardless. On a freshly started laboratory the passive detector observed all 500 packets with no crashes and, with the R2 code of the time, raised 608 findings across all four rules.</w:t>
       </w:r>
     </w:p>
     <w:p>
@@ -7398,6 +7716,23 @@
         <w:pStyle w:val="BodyText"/>
       </w:pPr>
       <w:r>
+        <w:t xml:space="preserve">Per-packet scores come from writing the same 500 packets to a file with their labels and scoring that file with the same engine (</w:t>
+      </w:r>
+      <w:r>
+        <w:rPr>
+          <w:rStyle w:val="VerbatimChar"/>
+        </w:rPr>
+        <w:t xml:space="preserve">make live-score</w:t>
+      </w:r>
+      <w:r>
+        <w:t xml:space="preserve">). This is valid because the live findings stream is identical, in order and content (rule, source, destination, TEID and detail), to that offline pass over the same corpus; this was checked for all 608 findings of the run before the fix and all 550 of the run after it. Table 13 reports the per-rule findings and the per-packet scores, before and after the R2 ownership fix of Section 3.6.2.</w:t>
+      </w:r>
+    </w:p>
+    <w:p>
+      <w:pPr>
+        <w:pStyle w:val="BodyText"/>
+      </w:pPr>
+      <w:r>
         <w:rPr>
           <w:b/>
         </w:rPr>
@@ -7407,7 +7742,7 @@
         <w:t xml:space="preserve"> </w:t>
       </w:r>
       <w:r>
-        <w:t xml:space="preserve">Findings raised by the detector on live transmitted traffic.</w:t>
+        <w:t xml:space="preserve">Findings and per-packet scores on the 500-packet live corpus, before and after the R2 ownership fix.</w:t>
       </w:r>
     </w:p>
     <w:tbl>
@@ -7434,7 +7769,7 @@
               <w:jc w:val="left"/>
             </w:pPr>
             <w:r>
-              <w:t xml:space="preserve">Rule</w:t>
+              <w:t xml:space="preserve">Rule or measure</w:t>
             </w:r>
           </w:p>
         </w:tc>
@@ -7448,10 +7783,10 @@
           <w:p>
             <w:pPr>
               <w:pStyle w:val="Compact"/>
-              <w:jc w:val="left"/>
-            </w:pPr>
-            <w:r>
-              <w:t xml:space="preserve">Abuse class</w:t>
+              <w:jc w:val="right"/>
+            </w:pPr>
+            <w:r>
+              <w:t xml:space="preserve">Before the R2 fix</w:t>
             </w:r>
           </w:p>
         </w:tc>
@@ -7468,147 +7803,147 @@
               <w:jc w:val="right"/>
             </w:pPr>
             <w:r>
-              <w:t xml:space="preserve">Findings</w:t>
-            </w:r>
-          </w:p>
-        </w:tc>
-      </w:tr>
-      <w:tr>
-        <w:tc>
-          <w:p>
-            <w:pPr>
-              <w:pStyle w:val="Compact"/>
-              <w:jc w:val="left"/>
-            </w:pPr>
-            <w:r>
-              <w:t xml:space="preserve">R1</w:t>
-            </w:r>
-          </w:p>
-        </w:tc>
-        <w:tc>
-          <w:p>
-            <w:pPr>
-              <w:pStyle w:val="Compact"/>
-              <w:jc w:val="left"/>
-            </w:pPr>
-            <w:r>
-              <w:t xml:space="preserve">Nested GTP tunnel</w:t>
-            </w:r>
-          </w:p>
-        </w:tc>
-        <w:tc>
-          <w:p>
-            <w:pPr>
-              <w:pStyle w:val="Compact"/>
-              <w:jc w:val="right"/>
-            </w:pPr>
-            <w:r>
-              <w:t xml:space="preserve">22</w:t>
-            </w:r>
-          </w:p>
-        </w:tc>
-      </w:tr>
-      <w:tr>
-        <w:tc>
-          <w:p>
-            <w:pPr>
-              <w:pStyle w:val="Compact"/>
-              <w:jc w:val="left"/>
-            </w:pPr>
-            <w:r>
-              <w:t xml:space="preserve">R2</w:t>
-            </w:r>
-          </w:p>
-        </w:tc>
-        <w:tc>
-          <w:p>
-            <w:pPr>
-              <w:pStyle w:val="Compact"/>
-              <w:jc w:val="left"/>
-            </w:pPr>
-            <w:r>
-              <w:t xml:space="preserve">TEID spoofing</w:t>
-            </w:r>
-          </w:p>
-        </w:tc>
-        <w:tc>
-          <w:p>
-            <w:pPr>
-              <w:pStyle w:val="Compact"/>
-              <w:jc w:val="right"/>
-            </w:pPr>
-            <w:r>
-              <w:t xml:space="preserve">17</w:t>
-            </w:r>
-          </w:p>
-        </w:tc>
-      </w:tr>
-      <w:tr>
-        <w:tc>
-          <w:p>
-            <w:pPr>
-              <w:pStyle w:val="Compact"/>
-              <w:jc w:val="left"/>
-            </w:pPr>
-            <w:r>
-              <w:t xml:space="preserve">R3</w:t>
-            </w:r>
-          </w:p>
-        </w:tc>
-        <w:tc>
-          <w:p>
-            <w:pPr>
-              <w:pStyle w:val="Compact"/>
-              <w:jc w:val="left"/>
-            </w:pPr>
-            <w:r>
-              <w:t xml:space="preserve">Control-plane smuggling</w:t>
-            </w:r>
-          </w:p>
-        </w:tc>
-        <w:tc>
-          <w:p>
-            <w:pPr>
-              <w:pStyle w:val="Compact"/>
-              <w:jc w:val="right"/>
-            </w:pPr>
-            <w:r>
-              <w:t xml:space="preserve">37</w:t>
-            </w:r>
-          </w:p>
-        </w:tc>
-      </w:tr>
-      <w:tr>
-        <w:tc>
-          <w:p>
-            <w:pPr>
-              <w:pStyle w:val="Compact"/>
-              <w:jc w:val="left"/>
-            </w:pPr>
-            <w:r>
-              <w:t xml:space="preserve">R4</w:t>
-            </w:r>
-          </w:p>
-        </w:tc>
-        <w:tc>
-          <w:p>
-            <w:pPr>
-              <w:pStyle w:val="Compact"/>
-              <w:jc w:val="left"/>
-            </w:pPr>
-            <w:r>
-              <w:t xml:space="preserve">Inner traffic to a core function</w:t>
-            </w:r>
-          </w:p>
-        </w:tc>
-        <w:tc>
-          <w:p>
-            <w:pPr>
-              <w:pStyle w:val="Compact"/>
-              <w:jc w:val="right"/>
-            </w:pPr>
-            <w:r>
-              <w:t xml:space="preserve">55</w:t>
+              <w:t xml:space="preserve">After the R2 fix</w:t>
+            </w:r>
+          </w:p>
+        </w:tc>
+      </w:tr>
+      <w:tr>
+        <w:tc>
+          <w:p>
+            <w:pPr>
+              <w:pStyle w:val="Compact"/>
+              <w:jc w:val="left"/>
+            </w:pPr>
+            <w:r>
+              <w:t xml:space="preserve">R1 Nested GTP tunnel</w:t>
+            </w:r>
+          </w:p>
+        </w:tc>
+        <w:tc>
+          <w:p>
+            <w:pPr>
+              <w:pStyle w:val="Compact"/>
+              <w:jc w:val="right"/>
+            </w:pPr>
+            <w:r>
+              <w:t xml:space="preserve">82</w:t>
+            </w:r>
+          </w:p>
+        </w:tc>
+        <w:tc>
+          <w:p>
+            <w:pPr>
+              <w:pStyle w:val="Compact"/>
+              <w:jc w:val="right"/>
+            </w:pPr>
+            <w:r>
+              <w:t xml:space="preserve">82</w:t>
+            </w:r>
+          </w:p>
+        </w:tc>
+      </w:tr>
+      <w:tr>
+        <w:tc>
+          <w:p>
+            <w:pPr>
+              <w:pStyle w:val="Compact"/>
+              <w:jc w:val="left"/>
+            </w:pPr>
+            <w:r>
+              <w:t xml:space="preserve">R2 TEID spoofing</w:t>
+            </w:r>
+          </w:p>
+        </w:tc>
+        <w:tc>
+          <w:p>
+            <w:pPr>
+              <w:pStyle w:val="Compact"/>
+              <w:jc w:val="right"/>
+            </w:pPr>
+            <w:r>
+              <w:t xml:space="preserve">146</w:t>
+            </w:r>
+          </w:p>
+        </w:tc>
+        <w:tc>
+          <w:p>
+            <w:pPr>
+              <w:pStyle w:val="Compact"/>
+              <w:jc w:val="right"/>
+            </w:pPr>
+            <w:r>
+              <w:t xml:space="preserve">88</w:t>
+            </w:r>
+          </w:p>
+        </w:tc>
+      </w:tr>
+      <w:tr>
+        <w:tc>
+          <w:p>
+            <w:pPr>
+              <w:pStyle w:val="Compact"/>
+              <w:jc w:val="left"/>
+            </w:pPr>
+            <w:r>
+              <w:t xml:space="preserve">R3 Control-plane smuggling</w:t>
+            </w:r>
+          </w:p>
+        </w:tc>
+        <w:tc>
+          <w:p>
+            <w:pPr>
+              <w:pStyle w:val="Compact"/>
+              <w:jc w:val="right"/>
+            </w:pPr>
+            <w:r>
+              <w:t xml:space="preserve">150</w:t>
+            </w:r>
+          </w:p>
+        </w:tc>
+        <w:tc>
+          <w:p>
+            <w:pPr>
+              <w:pStyle w:val="Compact"/>
+              <w:jc w:val="right"/>
+            </w:pPr>
+            <w:r>
+              <w:t xml:space="preserve">150</w:t>
+            </w:r>
+          </w:p>
+        </w:tc>
+      </w:tr>
+      <w:tr>
+        <w:tc>
+          <w:p>
+            <w:pPr>
+              <w:pStyle w:val="Compact"/>
+              <w:jc w:val="left"/>
+            </w:pPr>
+            <w:r>
+              <w:t xml:space="preserve">R4 Inner traffic to a core function</w:t>
+            </w:r>
+          </w:p>
+        </w:tc>
+        <w:tc>
+          <w:p>
+            <w:pPr>
+              <w:pStyle w:val="Compact"/>
+              <w:jc w:val="right"/>
+            </w:pPr>
+            <w:r>
+              <w:t xml:space="preserve">230</w:t>
+            </w:r>
+          </w:p>
+        </w:tc>
+        <w:tc>
+          <w:p>
+            <w:pPr>
+              <w:pStyle w:val="Compact"/>
+              <w:jc w:val="right"/>
+            </w:pPr>
+            <w:r>
+              <w:t xml:space="preserve">230</w:t>
             </w:r>
           </w:p>
         </w:tc>
@@ -7624,12 +7959,9 @@
               <w:rPr>
                 <w:b/>
               </w:rPr>
-              <w:t xml:space="preserve">Total</w:t>
-            </w:r>
-          </w:p>
-        </w:tc>
-        <w:tc>
-          <w:p/>
+              <w:t xml:space="preserve">Total findings</w:t>
+            </w:r>
+          </w:p>
         </w:tc>
         <w:tc>
           <w:p>
@@ -7641,7 +7973,301 @@
               <w:rPr>
                 <w:b/>
               </w:rPr>
-              <w:t xml:space="preserve">131</w:t>
+              <w:t xml:space="preserve">608</w:t>
+            </w:r>
+          </w:p>
+        </w:tc>
+        <w:tc>
+          <w:p>
+            <w:pPr>
+              <w:pStyle w:val="Compact"/>
+              <w:jc w:val="right"/>
+            </w:pPr>
+            <w:r>
+              <w:rPr>
+                <w:b/>
+              </w:rPr>
+              <w:t xml:space="preserve">550</w:t>
+            </w:r>
+          </w:p>
+        </w:tc>
+      </w:tr>
+      <w:tr>
+        <w:tc>
+          <w:p>
+            <w:pPr>
+              <w:pStyle w:val="Compact"/>
+              <w:jc w:val="left"/>
+            </w:pPr>
+            <w:r>
+              <w:t xml:space="preserve">True positives</w:t>
+            </w:r>
+          </w:p>
+        </w:tc>
+        <w:tc>
+          <w:p>
+            <w:pPr>
+              <w:pStyle w:val="Compact"/>
+              <w:jc w:val="right"/>
+            </w:pPr>
+            <w:r>
+              <w:t xml:space="preserve">385</w:t>
+            </w:r>
+          </w:p>
+        </w:tc>
+        <w:tc>
+          <w:p>
+            <w:pPr>
+              <w:pStyle w:val="Compact"/>
+              <w:jc w:val="right"/>
+            </w:pPr>
+            <w:r>
+              <w:t xml:space="preserve">400</w:t>
+            </w:r>
+          </w:p>
+        </w:tc>
+      </w:tr>
+      <w:tr>
+        <w:tc>
+          <w:p>
+            <w:pPr>
+              <w:pStyle w:val="Compact"/>
+              <w:jc w:val="left"/>
+            </w:pPr>
+            <w:r>
+              <w:t xml:space="preserve">False positives</w:t>
+            </w:r>
+          </w:p>
+        </w:tc>
+        <w:tc>
+          <w:p>
+            <w:pPr>
+              <w:pStyle w:val="Compact"/>
+              <w:jc w:val="right"/>
+            </w:pPr>
+            <w:r>
+              <w:t xml:space="preserve">16</w:t>
+            </w:r>
+          </w:p>
+        </w:tc>
+        <w:tc>
+          <w:p>
+            <w:pPr>
+              <w:pStyle w:val="Compact"/>
+              <w:jc w:val="right"/>
+            </w:pPr>
+            <w:r>
+              <w:t xml:space="preserve">0</w:t>
+            </w:r>
+          </w:p>
+        </w:tc>
+      </w:tr>
+      <w:tr>
+        <w:tc>
+          <w:p>
+            <w:pPr>
+              <w:pStyle w:val="Compact"/>
+              <w:jc w:val="left"/>
+            </w:pPr>
+            <w:r>
+              <w:t xml:space="preserve">False negatives</w:t>
+            </w:r>
+          </w:p>
+        </w:tc>
+        <w:tc>
+          <w:p>
+            <w:pPr>
+              <w:pStyle w:val="Compact"/>
+              <w:jc w:val="right"/>
+            </w:pPr>
+            <w:r>
+              <w:t xml:space="preserve">15</w:t>
+            </w:r>
+          </w:p>
+        </w:tc>
+        <w:tc>
+          <w:p>
+            <w:pPr>
+              <w:pStyle w:val="Compact"/>
+              <w:jc w:val="right"/>
+            </w:pPr>
+            <w:r>
+              <w:t xml:space="preserve">0</w:t>
+            </w:r>
+          </w:p>
+        </w:tc>
+      </w:tr>
+      <w:tr>
+        <w:tc>
+          <w:p>
+            <w:pPr>
+              <w:pStyle w:val="Compact"/>
+              <w:jc w:val="left"/>
+            </w:pPr>
+            <w:r>
+              <w:t xml:space="preserve">True negatives</w:t>
+            </w:r>
+          </w:p>
+        </w:tc>
+        <w:tc>
+          <w:p>
+            <w:pPr>
+              <w:pStyle w:val="Compact"/>
+              <w:jc w:val="right"/>
+            </w:pPr>
+            <w:r>
+              <w:t xml:space="preserve">84</w:t>
+            </w:r>
+          </w:p>
+        </w:tc>
+        <w:tc>
+          <w:p>
+            <w:pPr>
+              <w:pStyle w:val="Compact"/>
+              <w:jc w:val="right"/>
+            </w:pPr>
+            <w:r>
+              <w:t xml:space="preserve">100</w:t>
+            </w:r>
+          </w:p>
+        </w:tc>
+      </w:tr>
+      <w:tr>
+        <w:tc>
+          <w:p>
+            <w:pPr>
+              <w:pStyle w:val="Compact"/>
+              <w:jc w:val="left"/>
+            </w:pPr>
+            <w:r>
+              <w:t xml:space="preserve">Precision</w:t>
+            </w:r>
+          </w:p>
+        </w:tc>
+        <w:tc>
+          <w:p>
+            <w:pPr>
+              <w:pStyle w:val="Compact"/>
+              <w:jc w:val="right"/>
+            </w:pPr>
+            <w:r>
+              <w:t xml:space="preserve">0.960</w:t>
+            </w:r>
+          </w:p>
+        </w:tc>
+        <w:tc>
+          <w:p>
+            <w:pPr>
+              <w:pStyle w:val="Compact"/>
+              <w:jc w:val="right"/>
+            </w:pPr>
+            <w:r>
+              <w:t xml:space="preserve">1.0</w:t>
+            </w:r>
+          </w:p>
+        </w:tc>
+      </w:tr>
+      <w:tr>
+        <w:tc>
+          <w:p>
+            <w:pPr>
+              <w:pStyle w:val="Compact"/>
+              <w:jc w:val="left"/>
+            </w:pPr>
+            <w:r>
+              <w:t xml:space="preserve">Recall</w:t>
+            </w:r>
+          </w:p>
+        </w:tc>
+        <w:tc>
+          <w:p>
+            <w:pPr>
+              <w:pStyle w:val="Compact"/>
+              <w:jc w:val="right"/>
+            </w:pPr>
+            <w:r>
+              <w:t xml:space="preserve">0.9625</w:t>
+            </w:r>
+          </w:p>
+        </w:tc>
+        <w:tc>
+          <w:p>
+            <w:pPr>
+              <w:pStyle w:val="Compact"/>
+              <w:jc w:val="right"/>
+            </w:pPr>
+            <w:r>
+              <w:t xml:space="preserve">1.0</w:t>
+            </w:r>
+          </w:p>
+        </w:tc>
+      </w:tr>
+      <w:tr>
+        <w:tc>
+          <w:p>
+            <w:pPr>
+              <w:pStyle w:val="Compact"/>
+              <w:jc w:val="left"/>
+            </w:pPr>
+            <w:r>
+              <w:t xml:space="preserve">F1-score</w:t>
+            </w:r>
+          </w:p>
+        </w:tc>
+        <w:tc>
+          <w:p>
+            <w:pPr>
+              <w:pStyle w:val="Compact"/>
+              <w:jc w:val="right"/>
+            </w:pPr>
+            <w:r>
+              <w:t xml:space="preserve">0.961</w:t>
+            </w:r>
+          </w:p>
+        </w:tc>
+        <w:tc>
+          <w:p>
+            <w:pPr>
+              <w:pStyle w:val="Compact"/>
+              <w:jc w:val="right"/>
+            </w:pPr>
+            <w:r>
+              <w:t xml:space="preserve">1.0</w:t>
+            </w:r>
+          </w:p>
+        </w:tc>
+      </w:tr>
+      <w:tr>
+        <w:tc>
+          <w:p>
+            <w:pPr>
+              <w:pStyle w:val="Compact"/>
+              <w:jc w:val="left"/>
+            </w:pPr>
+            <w:r>
+              <w:t xml:space="preserve">False-positive rate</w:t>
+            </w:r>
+          </w:p>
+        </w:tc>
+        <w:tc>
+          <w:p>
+            <w:pPr>
+              <w:pStyle w:val="Compact"/>
+              <w:jc w:val="right"/>
+            </w:pPr>
+            <w:r>
+              <w:t xml:space="preserve">0.16</w:t>
+            </w:r>
+          </w:p>
+        </w:tc>
+        <w:tc>
+          <w:p>
+            <w:pPr>
+              <w:pStyle w:val="Compact"/>
+              <w:jc w:val="right"/>
+            </w:pPr>
+            <w:r>
+              <w:t xml:space="preserve">0.0</w:t>
             </w:r>
           </w:p>
         </w:tc>
@@ -7652,22 +8278,173 @@
         <w:pStyle w:val="BodyText"/>
       </w:pPr>
       <w:r>
-        <w:t xml:space="preserve">Fig. 5 places the offline and live per-rule counts side by side. Two qualifications are necessary and are stated rather than glossed. First, the counts are not comparable in magnitude: the corpora differ in size, seed and class construction, and the live path's send timing is not the offline path's deterministic replay. Second, and more importantly, the live run was not instrumented to record how many transmitted packets the sniffer actually observed, so no live recall can be computed and the gap between 131 findings and the count that the offline mix would predict cannot be attributed between packet loss, send timing and corpus composition. What the live run establishes is therefore narrower than parity of performance: it establishes that all four rules, in the same</w:t>
+        <w:rPr>
+          <w:i/>
+        </w:rPr>
+        <w:t xml:space="preserve">Before the R2 fix:</w:t>
       </w:r>
       <w:r>
         <w:t xml:space="preserve"> </w:t>
       </w:r>
       <w:r>
+        <w:t xml:space="preserve">live run on a freshly started laboratory.</w:t>
+      </w:r>
+      <w:r>
+        <w:t xml:space="preserve"> </w:t>
+      </w:r>
+      <w:r>
+        <w:rPr>
+          <w:i/>
+        </w:rPr>
+        <w:t xml:space="preserve">After the R2 fix:</w:t>
+      </w:r>
+      <w:r>
+        <w:t xml:space="preserve"> </w:t>
+      </w:r>
+      <w:r>
+        <w:t xml:space="preserve">live run on a freshly recreated detector, 500 of 500 packets observed, findings stream identical in order and content to the offline pass; four handset pings through the tunnel before the attack and four after it (40 GTP-U packets) raised no finding. Per-packet scores in both columns come from</w:t>
+      </w:r>
+      <w:r>
+        <w:t xml:space="preserve"> </w:t>
+      </w:r>
+      <w:r>
         <w:rPr>
           <w:rStyle w:val="VerbatimChar"/>
         </w:rPr>
+        <w:t xml:space="preserve">make live-score</w:t>
+      </w:r>
+      <w:r>
+        <w:t xml:space="preserve">, and the unit test</w:t>
+      </w:r>
+      <w:r>
+        <w:t xml:space="preserve"> </w:t>
+      </w:r>
+      <w:r>
+        <w:rPr>
+          <w:rStyle w:val="VerbatimChar"/>
+        </w:rPr>
+        <w:t xml:space="preserve">test_live_attack_corpus_scores_clean</w:t>
+      </w:r>
+      <w:r>
+        <w:t xml:space="preserve"> </w:t>
+      </w:r>
+      <w:r>
+        <w:t xml:space="preserve">now locks in the after-fix per-packet verdicts (every malicious packet flagged, every benign packet clean).</w:t>
+      </w:r>
+    </w:p>
+    <w:p>
+      <w:pPr>
+        <w:pStyle w:val="BodyText"/>
+      </w:pPr>
+      <w:r>
+        <w:t xml:space="preserve">Findings exceed the 400 malicious packets because rules overlap: every</w:t>
+      </w:r>
+      <w:r>
+        <w:t xml:space="preserve"> </w:t>
+      </w:r>
+      <w:r>
+        <w:rPr>
+          <w:rStyle w:val="VerbatimChar"/>
+        </w:rPr>
+        <w:t xml:space="preserve">pfcp_smuggle</w:t>
+      </w:r>
+      <w:r>
+        <w:t xml:space="preserve"> </w:t>
+      </w:r>
+      <w:r>
+        <w:t xml:space="preserve">and</w:t>
+      </w:r>
+      <w:r>
+        <w:t xml:space="preserve"> </w:t>
+      </w:r>
+      <w:r>
+        <w:rPr>
+          <w:rStyle w:val="VerbatimChar"/>
+        </w:rPr>
+        <w:t xml:space="preserve">ngap_smuggle</w:t>
+      </w:r>
+      <w:r>
+        <w:t xml:space="preserve"> </w:t>
+      </w:r>
+      <w:r>
+        <w:t xml:space="preserve">packet raises both R3 and R4, since its inner destination is the UPF. Every error in the run before the fix came from R2. All 16 false positives were a benign packet immediately after a</w:t>
+      </w:r>
+      <w:r>
+        <w:t xml:space="preserve"> </w:t>
+      </w:r>
+      <w:r>
+        <w:rPr>
+          <w:rStyle w:val="VerbatimChar"/>
+        </w:rPr>
+        <w:t xml:space="preserve">teid_spoof</w:t>
+      </w:r>
+      <w:r>
+        <w:t xml:space="preserve">: R2 had moved ownership of the TEID to the rogue source, so the gNB's own next packet looked like the spoof. All 15 false negatives were a</w:t>
+      </w:r>
+      <w:r>
+        <w:t xml:space="preserve"> </w:t>
+      </w:r>
+      <w:r>
+        <w:rPr>
+          <w:rStyle w:val="VerbatimChar"/>
+        </w:rPr>
+        <w:t xml:space="preserve">teid_spoof</w:t>
+      </w:r>
+      <w:r>
+        <w:t xml:space="preserve"> </w:t>
+      </w:r>
+      <w:r>
+        <w:t xml:space="preserve">immediately after another</w:t>
+      </w:r>
+      <w:r>
+        <w:t xml:space="preserve"> </w:t>
+      </w:r>
+      <w:r>
+        <w:rPr>
+          <w:rStyle w:val="VerbatimChar"/>
+        </w:rPr>
+        <w:t xml:space="preserve">teid_spoof</w:t>
+      </w:r>
+      <w:r>
+        <w:t xml:space="preserve">: the rogue already owned the TEID, so nothing changed. With first-source-wins ownership R2 fires exactly once per</w:t>
+      </w:r>
+      <w:r>
+        <w:t xml:space="preserve"> </w:t>
+      </w:r>
+      <w:r>
+        <w:rPr>
+          <w:rStyle w:val="VerbatimChar"/>
+        </w:rPr>
+        <w:t xml:space="preserve">teid_spoof</w:t>
+      </w:r>
+      <w:r>
+        <w:t xml:space="preserve"> </w:t>
+      </w:r>
+      <w:r>
+        <w:t xml:space="preserve">packet, 88 in all, and never on the gNB; R1, R3 and R4 are unchanged by the fix. A live figure reported in an earlier version of this work, 131 findings (R1 22, R2 17, R3 37, R4 55), did not reproduce and is withdrawn.</w:t>
+      </w:r>
+    </w:p>
+    <w:p>
+      <w:pPr>
+        <w:pStyle w:val="BodyText"/>
+      </w:pPr>
+      <w:r>
+        <w:t xml:space="preserve">Fig. 7 places the offline and live per-rule counts side by side. Two qualifications are necessary and are stated rather than glossed. First, the counts are not comparable in magnitude: the corpora differ in size, seed and class construction, and the live corpus sends every packet on one TEID while the offline corpus gives each spoof its own victim TEID. Second, the live per-packet scores in Table 13 are computed on the labelled offline pass over the identical packet sequence rather than on the live stream directly, and their validity rests on the finding-for-finding match between the two streams. What the live run establishes is that all four rules, in the same</w:t>
+      </w:r>
+      <w:r>
+        <w:t xml:space="preserve"> </w:t>
+      </w:r>
+      <w:r>
+        <w:rPr>
+          <w:rStyle w:val="VerbatimChar"/>
+        </w:rPr>
         <w:t xml:space="preserve">rules.py</w:t>
       </w:r>
       <w:r>
         <w:t xml:space="preserve"> </w:t>
       </w:r>
       <w:r>
-        <w:t xml:space="preserve">used offline, fire on packets that exist only because a real socket placed them on a real interface and a real dissector read them back off it. Given that the entire finding of Section 3.7 concerns the difference between in-memory objects and re-parsed wire bytes, that is the property the live run is needed to demonstrate, and it demonstrates it. Section 4.10 records the missing instrumentation as a limitation.</w:t>
+        <w:t xml:space="preserve">used offline, fire on packets that exist only because a real socket placed them on a real interface and a real dissector read them back off it, and that they produce exactly the findings the offline pass produces on the same bytes. Given that the entire finding of Section 3.7 concerns the difference between in-memory objects and re-parsed wire bytes, that is the property the live run is needed to demonstrate, and it demonstrates it. The live run also exposed something the offline corpus could not: because its spoofs and legitimate packets interleave on one TEID, it revealed the R2 ownership defect recorded as defect 7 in Section 4.9.</w:t>
       </w:r>
     </w:p>
     <w:p>
@@ -7679,7 +8456,7 @@
           <wp:inline>
             <wp:extent cx="3928703" cy="2435336"/>
             <wp:effectExtent b="0" l="0" r="0" t="0"/>
-            <wp:docPr descr="Findings per rule on the offline and live corpora" title="" id="1" name="Picture"/>
+            <wp:docPr descr="Findings per rule on the offline corpus and the live corpus before and after the R2 fix" title="" id="1" name="Picture"/>
             <a:graphic>
               <a:graphicData uri="http://schemas.openxmlformats.org/drawingml/2006/picture">
                 <pic:pic>
@@ -7690,7 +8467,7 @@
                     </pic:cNvPicPr>
                   </pic:nvPicPr>
                   <pic:blipFill>
-                    <a:blip r:embed="rId59"/>
+                    <a:blip r:embed="rId62"/>
                     <a:stretch>
                       <a:fillRect/>
                     </a:stretch>
@@ -7722,7 +8499,7 @@
         <w:pStyle w:val="ImageCaption"/>
       </w:pPr>
       <w:r>
-        <w:t xml:space="preserve">Findings per rule on the offline and live corpora</w:t>
+        <w:t xml:space="preserve">Findings per rule on the offline corpus and the live corpus before and after the R2 fix</w:t>
       </w:r>
     </w:p>
     <w:p>
@@ -7733,13 +8510,13 @@
         <w:rPr>
           <w:b/>
         </w:rPr>
-        <w:t xml:space="preserve">Fig. 5.</w:t>
+        <w:t xml:space="preserve">Fig. 7.</w:t>
       </w:r>
       <w:r>
         <w:t xml:space="preserve"> </w:t>
       </w:r>
       <w:r>
-        <w:t xml:space="preserve">Findings per rule on the offline and live corpora.</w:t>
+        <w:t xml:space="preserve">Findings per rule on the offline corpus and on the 500-packet live corpus, before and after the R2 fix.</w:t>
       </w:r>
     </w:p>
     <w:p>
@@ -7747,7 +8524,7 @@
         <w:pStyle w:val="BodyText"/>
       </w:pPr>
       <w:r>
-        <w:t xml:space="preserve">The offline path and the live detector container both ran Scapy 2.7.0 in the environment of Table 6; earlier runs of the offline path under Scapy 2.4.4 produced the same R1 behaviour. That the fix is not fragile across library versions is relevant but narrow evidence; a stronger question is whether the blind spot itself is a property of one library. It is not. We wrote a three-packet probe capture (</w:t>
+        <w:t xml:space="preserve">The offline path ran Scapy 2.4.4 and the live detector container Scapy 2.7.0, as Table 6 records, and R1 behaves identically under both. That the fix is not fragile across library versions is relevant but narrow evidence; a stronger question is whether the blind spot itself is a property of one library. It is not. We wrote a three-packet probe capture (</w:t>
       </w:r>
       <w:r>
         <w:rPr>
@@ -7768,7 +8545,7 @@
         <w:t xml:space="preserve">tshark</w:t>
       </w:r>
       <w:r>
-        <w:t xml:space="preserve">, every frame is recognised as GTP-U on the outer tunnel, but the nested frame's protocol stack ends at that outer header: its inner bytes are absorbed as an opaque T-PDU, with no second GTP layer and no inner IP, so a check for a GTP-U layer inside the payload returns nothing. The benign and smuggle frames decode to their inner IP exactly as in Scapy. On the same capture Zeek, an independently written network monitor, records exactly one GTPv1 tunnel and never a nested second tunnel; it logs the inner connections of the benign and smuggle packets through its tunnel-parent field, but the nested packet yields no inner connection and not even a weird-log entry, because Zeek forwards the decapsulated payload to its IP analyzer, which rejects the nested GTP-U header as non-IP and drops it. Scapy, tshark and Zeek, three independently written implementations that each forward only a payload they recognise as IP, therefore all miss the bare-nested form, which is evidence that the omission is a property of how tunnelled payloads are dispatched rather than a defect of one library. Extending the check to closed vendor stacks is the obvious next step and is not done here;</w:t>
+        <w:t xml:space="preserve">, every frame is recognised as GTP-U on the outer tunnel, but the nested frame's protocol stack ends at that outer header: its inner bytes are absorbed as an opaque T-PDU, with no second GTP layer and no inner IP, so a check for a GTP-U layer inside the payload returns nothing. The benign and smuggle frames decode to their inner IP exactly as in Scapy. On the same capture Zeek, an independently written network monitor, records exactly one GTPv1 tunnel and never a nested second tunnel; it logs the inner connections of the benign and smuggle packets through its tunnel-parent field, but the nested packet yields no inner connection and no second tunnel, because Zeek's GTPv1 analyzer finds that the decapsulated payload is neither IPv4 nor IPv6, records one analyzer violation,</w:t>
       </w:r>
       <w:r>
         <w:t xml:space="preserve"> </w:t>
@@ -7777,6 +8554,18 @@
         <w:rPr>
           <w:rStyle w:val="VerbatimChar"/>
         </w:rPr>
+        <w:t xml:space="preserve">non-IP packet in GTPv1</w:t>
+      </w:r>
+      <w:r>
+        <w:t xml:space="preserve">, and does not pass the payload on; the violation does not identify the payload as a tunnel. Scapy, tshark and Zeek, three independently written implementations that each forward only a payload they recognise as IP, therefore all miss the bare-nested form, which is evidence that the omission is a property of how tunnelled payloads are dispatched rather than a defect of one library. Extending the check to closed vendor stacks is the obvious next step and is not done here;</w:t>
+      </w:r>
+      <w:r>
+        <w:t xml:space="preserve"> </w:t>
+      </w:r>
+      <w:r>
+        <w:rPr>
+          <w:rStyle w:val="VerbatimChar"/>
+        </w:rPr>
         <w:t xml:space="preserve">REPRODUCE.md</w:t>
       </w:r>
       <w:r>
@@ -7790,18 +8579,18 @@
       <w:pPr>
         <w:pStyle w:val="Heading3"/>
       </w:pPr>
-      <w:bookmarkStart w:id="60" w:name="processing-cost"/>
+      <w:bookmarkStart w:id="63" w:name="processing-cost"/>
       <w:r>
         <w:t xml:space="preserve">4.8. Processing cost</w:t>
       </w:r>
-      <w:bookmarkEnd w:id="60"/>
+      <w:bookmarkEnd w:id="63"/>
     </w:p>
     <w:p>
       <w:pPr>
         <w:pStyle w:val="FirstParagraph"/>
       </w:pPr>
       <w:r>
-        <w:t xml:space="preserve">Table 14 and Fig. 7 report per-packet cost, measured over a full serialise, re-dissect and evaluate cycle on every packet of the 1,320-packet corpus, single core.</w:t>
+        <w:t xml:space="preserve">Table 14 and Fig. 8 report per-packet cost, measured over a full re-dissect and evaluate cycle (each packet is serialised before the timer starts) on every packet of the 1,320-packet corpus, single core.</w:t>
       </w:r>
     </w:p>
     <w:p>
@@ -8008,7 +8797,7 @@
                     </pic:cNvPicPr>
                   </pic:nvPicPr>
                   <pic:blipFill>
-                    <a:blip r:embed="rId61"/>
+                    <a:blip r:embed="rId64"/>
                     <a:stretch>
                       <a:fillRect/>
                     </a:stretch>
@@ -8051,7 +8840,7 @@
         <w:rPr>
           <w:b/>
         </w:rPr>
-        <w:t xml:space="preserve">Fig. 7.</w:t>
+        <w:t xml:space="preserve">Fig. 8.</w:t>
       </w:r>
       <w:r>
         <w:t xml:space="preserve"> </w:t>
@@ -8065,25 +8854,25 @@
         <w:pStyle w:val="BodyText"/>
       </w:pPr>
       <w:r>
-        <w:t xml:space="preserve">By Eq. (6) this implies a sustained single-core throughput of approximately 1,450 packets per second on this host. Two observations qualify that figure. First, it is dominated by dissection rather than by the rules: timing rule evaluation alone on the same corpus and host gives a mean of about 166 µs, implying roughly 6,000 packets per second, so approximately 76% of per-packet cost is attributable to parsing. The larger figure is the one a passive tap must actually pay, and the smaller one is reported here only to make the composition explicit and to warn against the natural but misleading instrumentation choice. Second, the absolute values are host-dependent and are not a property of the detector; earlier runs of this corpus on different hardware produced means between roughly 110 µs and 210 µs for the rules-only measurement. Any deployment claim requires measurement on the target hardware, at production N3 rates, with multi-core operation, none of which is attempted here.</w:t>
+        <w:t xml:space="preserve">By Eq. (6) this implies a sustained single-core throughput of approximately 1,450 packets per second on this host. Two observations qualify that figure. First, it is dominated by dissection rather than by the rules: approximately 76% of per-packet cost is attributable to parsing, so the rule-evaluation share is about 24% of 686 µs, roughly 165 µs or about 6,000 packets per second. That share is derived from the split, not measured on its own. An earlier version of the harness started its timer after dissection and so timed rule evaluation only, reporting about 206 µs, or about 4,850 packets per second; a figure of about 8,000 packets per second quoted in an earlier README had no recorded measurement behind it and is withdrawn. The 686 µs figure is the one a passive tap must actually pay, and the smaller figures are reported here only to make the composition explicit and to warn against the natural but misleading instrumentation choice. Second, the absolute values are host-dependent and are not a property of the detector; earlier runs of this corpus on different hardware produced means between roughly 110 µs and 210 µs for the rules-only measurement. Any deployment claim requires measurement on the target hardware, at production N3 rates, with multi-core operation, none of which is attempted here.</w:t>
       </w:r>
     </w:p>
     <w:p>
       <w:pPr>
         <w:pStyle w:val="Heading3"/>
       </w:pPr>
-      <w:bookmarkStart w:id="62" w:name="Xfc3d68e1ab090108ea08d822a01fab335365b9c"/>
+      <w:bookmarkStart w:id="65" w:name="Xfc3d68e1ab090108ea08d822a01fab335365b9c"/>
       <w:r>
         <w:t xml:space="preserve">4.9. Case study: passing every test versus working on the wire</w:t>
       </w:r>
-      <w:bookmarkEnd w:id="62"/>
+      <w:bookmarkEnd w:id="65"/>
     </w:p>
     <w:p>
       <w:pPr>
         <w:pStyle w:val="FirstParagraph"/>
       </w:pPr>
       <w:r>
-        <w:t xml:space="preserve">Before this investigation the offline test suite was fully green and the labelled corpus produced perfect precision, recall and F1 with a false-positive rate of zero. Bringing the live Docker laboratory up for the first time, which the project documentation describes as an equally central usage mode, exposed five real defects. Table 15 summarises them.</w:t>
+        <w:t xml:space="preserve">Before this investigation the offline test suite was fully green and the labelled corpus produced perfect precision, recall and F1 with a false-positive rate of zero. Bringing the live Docker laboratory up for the first time, which the project documentation describes as an equally central usage mode, exposed five real defects. Re-running the live laboratory during revision, with the offline suite again fully green, exposed two more: a capture during the documented ping showed that it bypassed the tunnel, and the UPF log showed that the handset data path had never worked, and scoring the live corpus packet by packet against its labels exposed the TEID-ownership defect. Table 15 summarises all seven.</w:t>
       </w:r>
     </w:p>
     <w:p>
@@ -8418,13 +9207,105 @@
           </w:p>
         </w:tc>
       </w:tr>
+      <w:tr>
+        <w:tc>
+          <w:p>
+            <w:pPr>
+              <w:pStyle w:val="Compact"/>
+              <w:jc w:val="left"/>
+            </w:pPr>
+            <w:r>
+              <w:t xml:space="preserve">6</w:t>
+            </w:r>
+          </w:p>
+        </w:tc>
+        <w:tc>
+          <w:p>
+            <w:pPr>
+              <w:pStyle w:val="Compact"/>
+              <w:jc w:val="left"/>
+            </w:pPr>
+            <w:r>
+              <w:t xml:space="preserve">The core container never configured the UPF's tunnel device, and the documented check of the handset data path bypassed the tunnel</w:t>
+            </w:r>
+          </w:p>
+        </w:tc>
+        <w:tc>
+          <w:p>
+            <w:pPr>
+              <w:pStyle w:val="Compact"/>
+              <w:jc w:val="left"/>
+            </w:pPr>
+            <w:r>
+              <w:t xml:space="preserve">The UPF decapsulated uplink GTP-U and then failed on every write to its tunnel device, so no handset packet reached the data network; the documented ping still returned replies, because the helper preloads its library by a relative path that the documented command could not resolve, so the loader skipped it and the ping left the radio container by its default route without touching the tunnel</w:t>
+            </w:r>
+          </w:p>
+        </w:tc>
+        <w:tc>
+          <w:p>
+            <w:pPr>
+              <w:pStyle w:val="Compact"/>
+              <w:jc w:val="left"/>
+            </w:pPr>
+            <w:r>
+              <w:t xml:space="preserve">Lives in container bring-up code the offline path never executes, and the live check passed for a reason unrelated to the tunnel</w:t>
+            </w:r>
+          </w:p>
+        </w:tc>
+      </w:tr>
+      <w:tr>
+        <w:tc>
+          <w:p>
+            <w:pPr>
+              <w:pStyle w:val="Compact"/>
+              <w:jc w:val="left"/>
+            </w:pPr>
+            <w:r>
+              <w:t xml:space="preserve">7</w:t>
+            </w:r>
+          </w:p>
+        </w:tc>
+        <w:tc>
+          <w:p>
+            <w:pPr>
+              <w:pStyle w:val="Compact"/>
+              <w:jc w:val="left"/>
+            </w:pPr>
+            <w:r>
+              <w:t xml:space="preserve">R2 moved ownership of a TEID to whichever source sent last, and keyed ownership on the TEID alone rather than on the receiving address and TEID</w:t>
+            </w:r>
+          </w:p>
+        </w:tc>
+        <w:tc>
+          <w:p>
+            <w:pPr>
+              <w:pStyle w:val="Compact"/>
+              <w:jc w:val="left"/>
+            </w:pPr>
+            <w:r>
+              <w:t xml:space="preserve">On the live corpus, where spoofs and legitimate packets interleave on one TEID, a benign packet straight after a spoof was flagged (16 false positives) and a spoof straight after a spoof was missed (15 false negatives)</w:t>
+            </w:r>
+          </w:p>
+        </w:tc>
+        <w:tc>
+          <w:p>
+            <w:pPr>
+              <w:pStyle w:val="Compact"/>
+              <w:jc w:val="left"/>
+            </w:pPr>
+            <w:r>
+              <w:t xml:space="preserve">The code runs offline, but the offline corpus gives every spoof its own victim TEID, emits every victim first and has a single receiver, so it never produces the triggering sequence</w:t>
+            </w:r>
+          </w:p>
+        </w:tc>
+      </w:tr>
     </w:tbl>
     <w:p>
       <w:pPr>
         <w:pStyle w:val="BodyText"/>
       </w:pPr>
       <w:r>
-        <w:t xml:space="preserve">None of the five was reachable from the offline tests. Defects 1, 2, 3 and 5 live entirely in deployment code that the offline path never runs. Defect 4 is the sharpest case, because the generator's packet-construction logic is shared between the pcap-write path, used by every offline test, and the live-send path, used only live. The offline path never calls the transmission functions at all, so a defect purely in how packets are transmitted, rather than in how they are built, was invisible to a perfect offline score.</w:t>
+        <w:t xml:space="preserve">None of the first five was reachable from the offline tests. Defects 1, 2, 3 and 5 live entirely in deployment code that the offline path never runs. Defect 4 is the sharpest case, because the generator's packet-construction logic is shared between the pcap-write path, used by every offline test, and the live-send path, used only live. The offline path never calls the transmission functions at all, so a defect purely in how packets are transmitted, rather than in how they are built, was invisible to a perfect offline score.</w:t>
       </w:r>
     </w:p>
     <w:p>
@@ -8432,6 +9313,53 @@
         <w:pStyle w:val="BodyText"/>
       </w:pPr>
       <w:r>
+        <w:t xml:space="preserve">The two defects found during revision extend the pattern. Defect 6 is again in deployment code, but it was hidden by a check rather than by an absence of checks: the documented ping through the</w:t>
+      </w:r>
+      <w:r>
+        <w:t xml:space="preserve"> </w:t>
+      </w:r>
+      <w:r>
+        <w:rPr>
+          <w:rStyle w:val="VerbatimChar"/>
+        </w:rPr>
+        <w:t xml:space="preserve">nr-binder</w:t>
+      </w:r>
+      <w:r>
+        <w:t xml:space="preserve"> </w:t>
+      </w:r>
+      <w:r>
+        <w:t xml:space="preserve">helper returned three replies out of three while a capture on the core showed no GTP-U at all. The core's entrypoint now gives the tunnel device</w:t>
+      </w:r>
+      <w:r>
+        <w:t xml:space="preserve"> </w:t>
+      </w:r>
+      <w:r>
+        <w:rPr>
+          <w:rStyle w:val="VerbatimChar"/>
+        </w:rPr>
+        <w:t xml:space="preserve">ogstun</w:t>
+      </w:r>
+      <w:r>
+        <w:t xml:space="preserve"> </w:t>
+      </w:r>
+      <w:r>
+        <w:t xml:space="preserve">the address 10.45.0.1/16, brings it up and translates the handset address pool out of the core's interface, and the check now binds the ping to the handset's tunnel interface directly (</w:t>
+      </w:r>
+      <w:r>
+        <w:rPr>
+          <w:rStyle w:val="VerbatimChar"/>
+        </w:rPr>
+        <w:t xml:space="preserve">ping -I uesimtun0</w:t>
+      </w:r>
+      <w:r>
+        <w:t xml:space="preserve">); the end-to-end result in Section 4.7 comes from that check. Defect 6 did not affect the detection results, because the attack generator is not a handset and does not use this path. Defect 7 is the only defect in detection logic, and the only one whose code the offline path does execute. R2 now keys ownership on the receiving address and TEID and lets the first source win (Section 3.6.2). Three new unit tests and an extended baseline test fail on the old code and pass on the new, and the offline benchmark, rerun over all five seeds, gives all 132 non-timing metrics identical to before the fix. The defect depends on the order of packets on one TEID rather than on any single packet, which is why a corpus built to avoid a shared TEID could not show it.</w:t>
+      </w:r>
+    </w:p>
+    <w:p>
+      <w:pPr>
+        <w:pStyle w:val="BodyText"/>
+      </w:pPr>
+      <w:r>
         <w:t xml:space="preserve">The general lesson is that for any tool whose value lies in reading or producing real wire traffic, a pcap-based or in-memory test suite is necessary but not sufficient. The specific failures that matter most for this class of tool, missing link-layer framing, a configuration writer that silently does nothing, and a parser fallback that discards the very bytes the detector is trying to inspect, are by construction invisible to any test that never serialises onto or deserialises off a real wire.</w:t>
       </w:r>
     </w:p>
@@ -8440,18 +9368,18 @@
         <w:pStyle w:val="BodyText"/>
       </w:pPr>
       <w:r>
-        <w:t xml:space="preserve">The same failure mode appeared a third time, at the level of the evaluation rather than the code, and is worth stating because it is the one most likely to recur in other work. An earlier corpus for this project paired 400 malicious packets with 400 copies of a single benign shape, all sharing one TEID (Section 3.5). That corpus produced a perfect score and a zero false-positive rate, and both numbers were artefacts: a negative class with one member cannot exercise a heuristic, and a shared TEID makes the ownership rule's behaviour a function of the corpus rather than of the rule. Scored on that corpus the current detector reports precision 0.911 and a false-positive rate of 0.095. The three instances, a parser fallback, an untested transmission path and a degenerate negative class, are the same underlying failure in three layers: code that looks correct, and in the case of R1 is provably correct against an in-memory test, but does the wrong thing or measures the wrong thing once real bytes and real diversity are involved. This mirrors, at the level of a single tool, the observation that drives recent implementation-focused work in this field, where driving real cores rather than models is what exposes the defects that matter (Bennett et al., 2024; Shaik et al., 2025), and it restates for a rule-based detector the evaluation critique that Sommer and Paxson (2010) directed at learned ones.</w:t>
+        <w:t xml:space="preserve">The same failure mode appeared a third time, at the level of the evaluation rather than the code, and is worth stating because it is the one most likely to recur in other work. An earlier corpus for this project paired 400 malicious packets with 400 copies of a single benign shape, all sharing one TEID (Section 3.5). That corpus produced a perfect score and a zero false-positive rate, and both numbers were artefacts: a negative class with one member cannot exercise a heuristic. Scored on that corpus, the detector as it stood before the fix of Section 4.9, with R2 handing ownership to whichever source sent last, reported precision 0.911 and a false-positive rate of 0.095, and the drop was attributed to the shared TEID rather than to the rule. Defect 7 shows that attribution was wrong: the oscillating ownership was the R2 defect, visible on that corpus but dismissed as a property of the corpus, and confirmed only when the labelled live run produced the same pattern. The three instances, a parser fallback, an untested transmission path and a degenerate negative class, are the same underlying failure in three layers: code that looks correct, and in the case of R1 is provably correct against an in-memory test, but does the wrong thing or measures the wrong thing once real bytes and real diversity are involved. This mirrors, at the level of a single tool, the observation that drives recent implementation-focused work in this field, where driving real cores rather than models is what exposes the defects that matter (Bennett et al., 2024; Shaik et al., 2025), and it restates for a rule-based detector the evaluation critique that Sommer and Paxson (2010) directed at learned ones.</w:t>
       </w:r>
     </w:p>
     <w:p>
       <w:pPr>
         <w:pStyle w:val="Heading3"/>
       </w:pPr>
-      <w:bookmarkStart w:id="63" w:name="X52ff2d3fb9ad798d718273b18077aeb7af3b8ef"/>
+      <w:bookmarkStart w:id="66" w:name="X52ff2d3fb9ad798d718273b18077aeb7af3b8ef"/>
       <w:r>
         <w:t xml:space="preserve">4.10. Discussion, limitations and threats to validity</w:t>
       </w:r>
-      <w:bookmarkEnd w:id="63"/>
+      <w:bookmarkEnd w:id="66"/>
     </w:p>
     <w:p>
       <w:pPr>
@@ -9241,7 +10169,7 @@
         <w:pStyle w:val="BodyText"/>
       </w:pPr>
       <w:r>
-        <w:t xml:space="preserve">The R1 re-parse remains a heuristic, now over five conditions rather than three. An attacker who knew the detector could attempt a non-standard GTP variant built to satisfy none of them while remaining acceptable to downstream equipment; the evasion suite tests four mutations but does not claim exhaustiveness, and such a variant's practical exploitability is untested here.</w:t>
+        <w:t xml:space="preserve">The R1 re-parse remains a heuristic, now over five conditions rather than three. An attacker who knew the detector could attempt a non-standard GTP variant built to satisfy none of them while remaining acceptable to downstream equipment; the evasion suite tests four mutations but does not claim exhaustiveness, and such a variant's practical exploitability is untested here. The re-parse also recovers only one nested header that forwards a routable inner packet: an attacker who nests twice defeats it, and the zero-length nested G-PDU behind CVE-2021-45462 carries no inner packet, so the length gate rejects it by design and, in the bare form, no rule fires; in the IP-wrapped form R3 still flags it as GTP-U inside the tunnel.</w:t>
       </w:r>
     </w:p>
     <w:p>
@@ -9249,7 +10177,16 @@
         <w:pStyle w:val="BodyText"/>
       </w:pPr>
       <w:r>
-        <w:t xml:space="preserve">R2 has no TEID lifecycle awareness. Ownership associations never expire, so a handset that releases a session and is later reassigned the same TEID, which is normal in long-running deployments, would trigger a false positive. The corpus does not exercise this case, so the real-world impact is unmeasured. R2 also attributes identity by source IP address, which a spoofer controls, and its handover suppression depends on a complete and current gNB inventory; both are demonstrated as blind spots in Table 12. R4 depends entirely on correct manual configuration of the core address set; a missing or incomplete allowlist silently disables the rule for the missing addresses rather than raising an error, as</w:t>
+        <w:t xml:space="preserve">R2 has no TEID lifecycle awareness. Ownership associations never expire, so a handset that releases a session and is later reassigned the same TEID, which is normal in long-running deployments, would trigger false positives if the new session arrives from a different source that is not an allowlisted gNB. Because ownership stays with the first source, those false positives would recur on every packet the new session sends. The corpus does not exercise this case, so the real-world impact is unmeasured. R2 also attributes identity by source IP address, which a spoofer controls, and its handover suppression depends on a complete and current gNB inventory: without the allowlist a handed-over session keeps alerting for as long as it sends from the new gNB. The first is demonstrated as a blind spot in Table 12 (</w:t>
+      </w:r>
+      <w:r>
+        <w:rPr>
+          <w:rStyle w:val="VerbatimChar"/>
+        </w:rPr>
+        <w:t xml:space="preserve">r2_spoofed_source_ip</w:t>
+      </w:r>
+      <w:r>
+        <w:t xml:space="preserve">); the second is measured in Table 11. R4 depends entirely on correct manual configuration of the core address set; a missing or incomplete allowlist silently disables the rule for the missing addresses rather than raising an error, as</w:t>
       </w:r>
       <w:r>
         <w:t xml:space="preserve"> </w:t>
@@ -9272,7 +10209,7 @@
         <w:pStyle w:val="BodyText"/>
       </w:pPr>
       <w:r>
-        <w:t xml:space="preserve">The live experiment carries three specific limitations. The attack generator shares the core's network namespace, so its packets originate on the UPF host rather than arriving from a remote N3 endpoint; the live run therefore validates behaviour on transmitted bytes but does not demonstrate detection of the remote adversary of Section 2.2. The run was not instrumented to record packets observed by the sniffer, so no live recall is reported and the finding counts of Table 13 cannot be converted into a detection rate. And the live counts are from a single run rather than from repeated trials.</w:t>
+        <w:t xml:space="preserve">The live experiment carries three specific limitations. The attack generator shares the core's network namespace and is not a handset, so its packets originate on the UPF host rather than arriving from a remote N3 endpoint, and whether the UPF acts on the crafted frames was not measured; the live run therefore validates behaviour on transmitted bytes but does not demonstrate detection of the remote adversary of Section 2.2. The per-packet scores of Table 13 are computed on a labelled offline pass over the identical packet sequence, and rest on the finding-for-finding match between that pass and the live stream rather than on labels attached to the live capture itself. And the live results come from a single corpus seed and one live run per code version, before and after the fix, rather than from repeated trials, with only an IPv4 PDU session; Unstructured and Ethernet session types were not exercised.</w:t>
       </w:r>
     </w:p>
     <w:p>
@@ -9280,7 +10217,7 @@
         <w:pStyle w:val="BodyText"/>
       </w:pPr>
       <w:r>
-        <w:t xml:space="preserve">The evaluation used a single subscriber, a single PDU session and the test PLMN only, with no roaming, multi-slice or multi-gNB scenarios, and it validated against one core implementation rather than the six examined by Shaik et al. (2025). IPv6 inner traffic is covered by R1 but not by the R3 and R4 inner-address checks, which inspect IPv4. Performance was measured single-core on one unloaded laboratory virtual machine; the figure near 1,450 packets per second is host-specific and is not validated against production N3 rates, which can be substantially higher, and no multi-core or sustained-load testing was performed.</w:t>
+        <w:t xml:space="preserve">The evaluation used a single subscriber, a single PDU session and the test PLMN only, with no roaming, multi-slice or multi-gNB scenarios, and it validated against one core implementation rather than the six examined by Shaik et al. (2025). IPv6 inner traffic is covered by R1 and by R3's UDP port checks, but R3's SCTP check and R4 inspect IPv4 inner packets only, so SCTP smuggling or core targeting inside an IPv6 inner packet is not detected. Performance was measured single-core on one unloaded laboratory virtual machine; the figure near 1,450 packets per second is host-specific and is not validated against production N3 rates, which can be substantially higher, and no multi-core or sustained-load testing was performed.</w:t>
       </w:r>
     </w:p>
     <w:p>
@@ -9294,11 +10231,11 @@
       <w:pPr>
         <w:pStyle w:val="Heading2"/>
       </w:pPr>
-      <w:bookmarkStart w:id="64" w:name="conclusion"/>
+      <w:bookmarkStart w:id="67" w:name="conclusion"/>
       <w:r>
         <w:t xml:space="preserve">5. Conclusion</w:t>
       </w:r>
-      <w:bookmarkEnd w:id="64"/>
+      <w:bookmarkEnd w:id="67"/>
     </w:p>
     <w:p>
       <w:pPr>
@@ -9325,7 +10262,7 @@
         <w:pStyle w:val="BodyText"/>
       </w:pPr>
       <w:r>
-        <w:t xml:space="preserve">The four-rule engine achieved precision, recall and F1 of 1.0 with a false-positive rate of 0.0 on a seeded 1,320-packet corpus whose 720 benign packets span twelve categories including two adversarial ones, with zero variance across five seeds and at a mean per-packet cost of 686 µs including dissection. Three measurements accompany that score and are the reason it should be believed rather than discounted: a naive baseline identical in every respect except the payload re-parse reaches F1 0.889 and misses 100% of nested tunnels; every false positive the detector produces in any configuration, six in 720 benign packets, is a legitimate handover and is removed by an operator-supplied gNB allowlist; and four of eleven crafted evasions succeed and are documented as blind spots rather than suppressed, while a fifth expected non-detection, GTP-looking noise with no routable inner IP, is correct silence rather than a miss. The same engine raised 131 findings across all four rules on live traffic from a real Open5GS core and UERANSIM radio simulator.</w:t>
+        <w:t xml:space="preserve">The four-rule engine achieved precision, recall and F1 of 1.0 with a false-positive rate of 0.0 on a seeded 1,320-packet corpus whose 720 benign packets span twelve categories including two adversarial ones, with zero variance across five seeds and at a mean per-packet cost of 686 µs including dissection. Three measurements accompany that score and are the reason it should be believed rather than discounted: a naive baseline identical in every respect except the payload re-parse reaches F1 0.889 and misses 100% of nested tunnels; every false positive the detector produces in any configuration, six in 720 benign packets, is a legitimate handover and is removed by an operator-supplied gNB allowlist; and four of eleven crafted evasions succeed and are documented as blind spots rather than suppressed, while a fifth expected non-detection, GTP-looking noise with no routable inner IP, is correct silence rather than a miss. On a 500-packet labelled corpus transmitted onto the N3 interface of a real Open5GS core and UERANSIM radio simulator, the same engine observed every packet, raised findings from all four rules, and matched an offline pass over the same packets finding for finding. Scored against its labels, that corpus exposed an R2 ownership defect (precision 0.960, false-positive rate 0.16); with the defect fixed, the same sequence scores precision, recall and F1 of 1.0 with a false-positive rate of 0.0.</w:t>
       </w:r>
     </w:p>
     <w:p>
@@ -9333,7 +10270,7 @@
         <w:pStyle w:val="BodyText"/>
       </w:pPr>
       <w:r>
-        <w:t xml:space="preserve">The detector's main technical result is a specific and general robustness requirement for passive GTP-U inspection: default parsing libraries can silently discard the structure a detector is trying to detect, in a way that an in-memory unit test cannot see, and correcting this restored nested-tunnel detection from 0.0 to 1.0. The project's own history proved to be two further instances of the same lesson at different layers, five deployment defects reachable only by running the live path, and an earlier corpus whose perfect score was an artefact of a single-shape negative class. Together they form a concrete argument that for security tools that touch real traffic, running the live path end to end and evaluating against a deliberately diverse negative class are required validation steps rather than optional demonstrations that a passing offline suite can stand in for.</w:t>
+        <w:t xml:space="preserve">The detector's main technical result is a specific and general robustness requirement for passive GTP-U inspection: default parsing libraries can silently discard the structure a detector is trying to detect, in a way that an in-memory unit test cannot see, and correcting this restored nested-tunnel detection from 0.0 to 1.0. The project's own history proved to be two further instances of the same lesson at different layers: seven defects reachable only by running the live path, six in deployment code and one in the spoofing rule that the offline corpus never triggered, and an earlier corpus whose perfect score was an artefact of a single-shape negative class. Together they form a concrete argument that for security tools that touch real traffic, running the live path end to end and evaluating against a deliberately diverse negative class are required validation steps rather than optional demonstrations that a passing offline suite can stand in for.</w:t>
       </w:r>
     </w:p>
     <w:p>
@@ -9341,7 +10278,7 @@
         <w:pStyle w:val="BodyText"/>
       </w:pPr>
       <w:r>
-        <w:t xml:space="preserve">Several extensions follow from the limitations. Stateful TEID tracking with explicit expiry, and binding tunnel identity to something a spoofer does not control, would address the two R2 blind spots. Extending the R3 and R4 inner-address checks to IPv6, and deriving the R4 core address set from the core's own configuration rather than a manual flag, would address the remaining two. Adversarial evaluation in the manner of Salazar et al. (2023), mutating the five attack classes systematically rather than through eleven hand-built cases, would probe the boundaries of each rule further, in particular the R1 re-parse gate. Repeating the live experiment with the attack generator in a separate network namespace, and instrumenting the sniffer to report observed packet counts, would let live recall be measured against the threat model of Section 2.2 rather than inferred. Validation against several core implementations, as Shaik et al. (2025) do for the attack side, would establish that the results are not an artefact of one implementation, and a multi-gNB or roaming topology would allow the TEID-reuse-across-handover case to be tested realistically. A further direction is to treat the per-rule findings as a feature vector for a downstream classifier rather than as a terminal signal, retaining the readable rules as features so that the interpretability concerns raised by Sommer and Paxson (2010) and by Manca et al. (2026) are addressed rather than inherited. Finally, evaluation under realistic class imbalance, at production-scale N3 rates and with multi-core operation, is required before any deployment claim can be made.</w:t>
+        <w:t xml:space="preserve">Several extensions follow from the limitations. Stateful TEID tracking with explicit expiry, and binding tunnel identity to something a spoofer does not control, would address the two R2 blind spots. Extending R3's SCTP check and R4 to IPv6 would close the IPv6 gap; classifying R3 payloads independently of port, and deriving the R4 core address set from the core's own configuration rather than a manual flag, would address the remaining two blind spots. Adversarial evaluation in the manner of Salazar et al. (2023), mutating the five attack classes systematically rather than through eleven hand-built cases, would probe the boundaries of each rule further, in particular the R1 re-parse gate. Repeating the live experiment with the attack generator in a separate network namespace, as a remote endpoint on the N3 segment, and measuring whether the UPF acts on the crafted frames, would test detection against the threat model of Section 2.2 directly rather than through a co-located generator. Validation against several core implementations, as Shaik et al. (2025) do for the attack side, would establish that the results are not an artefact of one implementation, and a multi-gNB or roaming topology would allow the TEID-reuse-across-handover case to be tested realistically. A further direction is to treat the per-rule findings as a feature vector for a downstream classifier rather than as a terminal signal, retaining the readable rules as features so that the interpretability concerns raised by Sommer and Paxson (2010) and by Manca et al. (2026) are addressed rather than inherited. Finally, evaluation under realistic class imbalance, at production-scale N3 rates and with multi-core operation, is required before any deployment claim can be made.</w:t>
       </w:r>
     </w:p>
     <w:p>
@@ -9355,11 +10292,11 @@
       <w:pPr>
         <w:pStyle w:val="Heading2"/>
       </w:pPr>
-      <w:bookmarkStart w:id="65" w:name="declaration-of-competing-interest"/>
+      <w:bookmarkStart w:id="68" w:name="declaration-of-competing-interest"/>
       <w:r>
         <w:t xml:space="preserve">Declaration of Competing Interest</w:t>
       </w:r>
-      <w:bookmarkEnd w:id="65"/>
+      <w:bookmarkEnd w:id="68"/>
     </w:p>
     <w:p>
       <w:pPr>
@@ -9373,11 +10310,11 @@
       <w:pPr>
         <w:pStyle w:val="Heading2"/>
       </w:pPr>
-      <w:bookmarkStart w:id="66" w:name="data-availability"/>
+      <w:bookmarkStart w:id="69" w:name="data-availability"/>
       <w:r>
         <w:t xml:space="preserve">Data availability</w:t>
       </w:r>
-      <w:bookmarkEnd w:id="66"/>
+      <w:bookmarkEnd w:id="69"/>
     </w:p>
     <w:p>
       <w:pPr>
@@ -9391,11 +10328,11 @@
       <w:pPr>
         <w:pStyle w:val="Heading2"/>
       </w:pPr>
-      <w:bookmarkStart w:id="67" w:name="references"/>
+      <w:bookmarkStart w:id="70" w:name="references"/>
       <w:r>
         <w:t xml:space="preserve">References</w:t>
       </w:r>
-      <w:bookmarkEnd w:id="67"/>
+      <w:bookmarkEnd w:id="70"/>
     </w:p>
     <w:p>
       <w:pPr>

</xml_diff>